<commit_message>
Completa el Tema 7: diapositivas, infografías, teoría y Actividad 7.1 rehecha sobre papel
- Teoría: tabla de qué se comprueba en cada pilar y cómo se corrige, e infografías de estrategias de recuperación y de eslabón más débil.
- Diapositivas de Well-Architected (30), con su PDF embebido en la teoría.
- Actividad 7.1 sin necesidad de abrir AWS: ficha de la arquitectura de Escaparate con infografía, pistas sobre lo que ya no se usa, auditoría de la clínica en la Parte B y rúbrica 5-5.
- Plantilla Word del alumno regenerada.
</commit_message>
<xml_diff>
--- a/docs/tema7/plantillas/Actividad_7_1_INU_Plantilla.docx
+++ b/docs/tema7/plantillas/Actividad_7_1_INU_Plantilla.docx
@@ -167,7 +167,7 @@
                 <w:sz w:val="20"/>
                 <w:szCs w:val="20"/>
               </w:rPr>
-              <w:t xml:space="preserve">Identificador de recursos usado (ej. escaparate-imagenes-&lt;tu-identificador&gt;): _______________________</w:t>
+              <w:t xml:space="preserve">Identificador (el mismo que has puesto como nombre de tu estimación en la calculadora): _______________________</w:t>
             </w:r>
           </w:p>
         </w:tc>
@@ -198,9 +198,191 @@
           <w:sz w:val="26"/>
           <w:szCs w:val="26"/>
         </w:rPr>
-        <w:t xml:space="preserve">Parte A — Audita tu propia arquitectura</w:t>
+        <w:t xml:space="preserve">Parte A — Audita Escaparate</w:t>
       </w:r>
     </w:p>
+    <w:p>
+      <w:pPr>
+        <w:spacing w:after="80"/>
+      </w:pPr>
+    </w:p>
+    <w:p>
+      <w:pPr>
+        <w:pBdr>
+          <w:bottom w:val="single" w:color="FFA000" w:sz="4" w:space="1"/>
+        </w:pBdr>
+        <w:spacing w:after="120" w:before="240"/>
+      </w:pPr>
+      <w:r>
+        <w:rPr>
+          <w:rFonts w:ascii="Arial" w:cs="Arial" w:eastAsia="Arial" w:hAnsi="Arial"/>
+          <w:b/>
+          <w:bCs/>
+          <w:color w:val="3949AB"/>
+          <w:sz w:val="24"/>
+          <w:szCs w:val="24"/>
+        </w:rPr>
+        <w:t xml:space="preserve">Paso 1 — Apunta tus sospechas antes de analizar nada</w:t>
+      </w:r>
+    </w:p>
+    <w:p>
+      <w:pPr>
+        <w:spacing w:after="100"/>
+      </w:pPr>
+      <w:r>
+        <w:rPr>
+          <w:rFonts w:ascii="Arial" w:cs="Arial" w:eastAsia="Arial" w:hAnsi="Arial"/>
+          <w:color w:val="212121"/>
+          <w:sz w:val="22"/>
+          <w:szCs w:val="22"/>
+        </w:rPr>
+        <w:t xml:space="preserve">Los tres problemas que crees que más pesan en la ficha, con su pilar, escritos antes de empezar el Paso 2:</w:t>
+      </w:r>
+    </w:p>
+    <w:tbl>
+      <w:tblPr>
+        <w:tblW w:type="dxa" w:w="9638"/>
+        <w:tblBorders>
+          <w:top w:val="single" w:color="auto" w:sz="4"/>
+          <w:left w:val="single" w:color="auto" w:sz="4"/>
+          <w:bottom w:val="single" w:color="auto" w:sz="4"/>
+          <w:right w:val="single" w:color="auto" w:sz="4"/>
+          <w:insideH w:val="single" w:color="auto" w:sz="4"/>
+          <w:insideV w:val="single" w:color="auto" w:sz="4"/>
+        </w:tblBorders>
+      </w:tblPr>
+      <w:tblGrid>
+        <w:gridCol w:w="9638"/>
+      </w:tblGrid>
+      <w:tr>
+        <w:trPr>
+          <w:trHeight w:val="480"/>
+        </w:trPr>
+        <w:tc>
+          <w:tcPr>
+            <w:tcW w:type="dxa" w:w="9638"/>
+            <w:tcBorders>
+              <w:top w:val="single" w:color="E0E0E0" w:sz="4"/>
+              <w:left w:val="single" w:color="E0E0E0" w:sz="4"/>
+              <w:bottom w:val="single" w:color="E0E0E0" w:sz="4"/>
+              <w:right w:val="single" w:color="E0E0E0" w:sz="4"/>
+            </w:tcBorders>
+            <w:shd w:fill="FAFAFA" w:val="clear"/>
+            <w:tcMar>
+              <w:top w:type="dxa" w:w="60"/>
+              <w:left w:type="dxa" w:w="160"/>
+              <w:bottom w:type="dxa" w:w="60"/>
+              <w:right w:type="dxa" w:w="160"/>
+            </w:tcMar>
+          </w:tcPr>
+          <w:p>
+            <w:r>
+              <w:rPr>
+                <w:sz w:val="22"/>
+                <w:szCs w:val="22"/>
+              </w:rPr>
+              <w:t xml:space="preserve"/>
+            </w:r>
+          </w:p>
+        </w:tc>
+      </w:tr>
+      <w:tr>
+        <w:trPr>
+          <w:trHeight w:val="480"/>
+        </w:trPr>
+        <w:tc>
+          <w:tcPr>
+            <w:tcW w:type="dxa" w:w="9638"/>
+            <w:tcBorders>
+              <w:top w:val="single" w:color="E0E0E0" w:sz="4"/>
+              <w:left w:val="single" w:color="E0E0E0" w:sz="4"/>
+              <w:bottom w:val="single" w:color="E0E0E0" w:sz="4"/>
+              <w:right w:val="single" w:color="E0E0E0" w:sz="4"/>
+            </w:tcBorders>
+            <w:shd w:fill="FAFAFA" w:val="clear"/>
+            <w:tcMar>
+              <w:top w:type="dxa" w:w="60"/>
+              <w:left w:type="dxa" w:w="160"/>
+              <w:bottom w:type="dxa" w:w="60"/>
+              <w:right w:type="dxa" w:w="160"/>
+            </w:tcMar>
+          </w:tcPr>
+          <w:p>
+            <w:r>
+              <w:rPr>
+                <w:sz w:val="22"/>
+                <w:szCs w:val="22"/>
+              </w:rPr>
+              <w:t xml:space="preserve"/>
+            </w:r>
+          </w:p>
+        </w:tc>
+      </w:tr>
+      <w:tr>
+        <w:trPr>
+          <w:trHeight w:val="480"/>
+        </w:trPr>
+        <w:tc>
+          <w:tcPr>
+            <w:tcW w:type="dxa" w:w="9638"/>
+            <w:tcBorders>
+              <w:top w:val="single" w:color="E0E0E0" w:sz="4"/>
+              <w:left w:val="single" w:color="E0E0E0" w:sz="4"/>
+              <w:bottom w:val="single" w:color="E0E0E0" w:sz="4"/>
+              <w:right w:val="single" w:color="E0E0E0" w:sz="4"/>
+            </w:tcBorders>
+            <w:shd w:fill="FAFAFA" w:val="clear"/>
+            <w:tcMar>
+              <w:top w:type="dxa" w:w="60"/>
+              <w:left w:type="dxa" w:w="160"/>
+              <w:bottom w:type="dxa" w:w="60"/>
+              <w:right w:type="dxa" w:w="160"/>
+            </w:tcMar>
+          </w:tcPr>
+          <w:p>
+            <w:r>
+              <w:rPr>
+                <w:sz w:val="22"/>
+                <w:szCs w:val="22"/>
+              </w:rPr>
+              <w:t xml:space="preserve"/>
+            </w:r>
+          </w:p>
+        </w:tc>
+      </w:tr>
+      <w:tr>
+        <w:trPr>
+          <w:trHeight w:val="480"/>
+        </w:trPr>
+        <w:tc>
+          <w:tcPr>
+            <w:tcW w:type="dxa" w:w="9638"/>
+            <w:tcBorders>
+              <w:top w:val="single" w:color="E0E0E0" w:sz="4"/>
+              <w:left w:val="single" w:color="E0E0E0" w:sz="4"/>
+              <w:bottom w:val="single" w:color="E0E0E0" w:sz="4"/>
+              <w:right w:val="single" w:color="E0E0E0" w:sz="4"/>
+            </w:tcBorders>
+            <w:shd w:fill="FAFAFA" w:val="clear"/>
+            <w:tcMar>
+              <w:top w:type="dxa" w:w="60"/>
+              <w:left w:type="dxa" w:w="160"/>
+              <w:bottom w:type="dxa" w:w="60"/>
+              <w:right w:type="dxa" w:w="160"/>
+            </w:tcMar>
+          </w:tcPr>
+          <w:p>
+            <w:r>
+              <w:rPr>
+                <w:sz w:val="22"/>
+                <w:szCs w:val="22"/>
+              </w:rPr>
+              <w:t xml:space="preserve"/>
+            </w:r>
+          </w:p>
+        </w:tc>
+      </w:tr>
+    </w:tbl>
     <w:p>
       <w:pPr>
         <w:spacing w:after="120"/>
@@ -222,7 +404,7 @@
           <w:sz w:val="24"/>
           <w:szCs w:val="24"/>
         </w:rPr>
-        <w:t xml:space="preserve">Paso 1 — Haz el inventario de lo que tenías</w:t>
+        <w:t xml:space="preserve">Paso 2 — Pasa los seis pilares por la ficha</w:t>
       </w:r>
     </w:p>
     <w:tbl>
@@ -238,15 +420,16 @@
         </w:tblBorders>
       </w:tblPr>
       <w:tblGrid>
+        <w:gridCol w:w="1349"/>
+        <w:gridCol w:w="3277"/>
         <w:gridCol w:w="1928"/>
-        <w:gridCol w:w="3277"/>
         <w:gridCol w:w="1349"/>
-        <w:gridCol w:w="3084"/>
+        <w:gridCol w:w="1735"/>
       </w:tblGrid>
       <w:tr>
         <w:tc>
           <w:tcPr>
-            <w:tcW w:type="dxa" w:w="1928"/>
+            <w:tcW w:type="dxa" w:w="1349"/>
             <w:tcBorders>
               <w:top w:val="single" w:color="E0E0E0" w:sz="4"/>
               <w:left w:val="single" w:color="E0E0E0" w:sz="4"/>
@@ -274,7 +457,7 @@
                 <w:sz w:val="20"/>
                 <w:szCs w:val="20"/>
               </w:rPr>
-              <w:t xml:space="preserve">Componente</w:t>
+              <w:t xml:space="preserve">Pilar</w:t>
             </w:r>
           </w:p>
         </w:tc>
@@ -308,13 +491,13 @@
                 <w:sz w:val="20"/>
                 <w:szCs w:val="20"/>
               </w:rPr>
-              <w:t xml:space="preserve">Configuración exacta</w:t>
-            </w:r>
-          </w:p>
-        </w:tc>
-        <w:tc>
-          <w:tcPr>
-            <w:tcW w:type="dxa" w:w="1349"/>
+              <w:t xml:space="preserve">Hallazgo (o «sin hallazgos» y qué has comprobado)</w:t>
+            </w:r>
+          </w:p>
+        </w:tc>
+        <w:tc>
+          <w:tcPr>
+            <w:tcW w:type="dxa" w:w="1928"/>
             <w:tcBorders>
               <w:top w:val="single" w:color="E0E0E0" w:sz="4"/>
               <w:left w:val="single" w:color="E0E0E0" w:sz="4"/>
@@ -342,13 +525,13 @@
                 <w:sz w:val="20"/>
                 <w:szCs w:val="20"/>
               </w:rPr>
-              <w:t xml:space="preserve">Zona(s)</w:t>
-            </w:r>
-          </w:p>
-        </w:tc>
-        <w:tc>
-          <w:tcPr>
-            <w:tcW w:type="dxa" w:w="3084"/>
+              <w:t xml:space="preserve">Fila de la ficha</w:t>
+            </w:r>
+          </w:p>
+        </w:tc>
+        <w:tc>
+          <w:tcPr>
+            <w:tcW w:type="dxa" w:w="1349"/>
             <w:tcBorders>
               <w:top w:val="single" w:color="E0E0E0" w:sz="4"/>
               <w:left w:val="single" w:color="E0E0E0" w:sz="4"/>
@@ -376,1142 +559,31 @@
                 <w:sz w:val="20"/>
                 <w:szCs w:val="20"/>
               </w:rPr>
-              <w:t xml:space="preserve">Quién puede llegar a él</w:t>
-            </w:r>
-          </w:p>
-        </w:tc>
-      </w:tr>
-      <w:tr>
-        <w:trPr>
-          <w:trHeight w:val="800"/>
-        </w:trPr>
-        <w:tc>
-          <w:tcPr>
-            <w:tcW w:type="dxa" w:w="1928"/>
-            <w:tcBorders>
-              <w:top w:val="single" w:color="E0E0E0" w:sz="4"/>
-              <w:left w:val="single" w:color="E0E0E0" w:sz="4"/>
-              <w:bottom w:val="single" w:color="E0E0E0" w:sz="4"/>
-              <w:right w:val="single" w:color="E0E0E0" w:sz="4"/>
-            </w:tcBorders>
-            <w:shd w:fill="FFFFFF" w:val="clear"/>
-            <w:tcMar>
-              <w:top w:type="dxa" w:w="80"/>
-              <w:left w:type="dxa" w:w="140"/>
-              <w:bottom w:type="dxa" w:w="80"/>
-              <w:right w:type="dxa" w:w="100"/>
-            </w:tcMar>
-          </w:tcPr>
-          <w:p>
-            <w:r>
-              <w:rPr>
-                <w:sz w:val="22"/>
-                <w:szCs w:val="22"/>
-              </w:rPr>
-              <w:t xml:space="preserve"/>
-            </w:r>
-          </w:p>
-        </w:tc>
-        <w:tc>
-          <w:tcPr>
-            <w:tcW w:type="dxa" w:w="3277"/>
-            <w:tcBorders>
-              <w:top w:val="single" w:color="E0E0E0" w:sz="4"/>
-              <w:left w:val="single" w:color="E0E0E0" w:sz="4"/>
-              <w:bottom w:val="single" w:color="E0E0E0" w:sz="4"/>
-              <w:right w:val="single" w:color="E0E0E0" w:sz="4"/>
-            </w:tcBorders>
-            <w:shd w:fill="FFFFFF" w:val="clear"/>
-            <w:tcMar>
-              <w:top w:type="dxa" w:w="80"/>
-              <w:left w:type="dxa" w:w="140"/>
-              <w:bottom w:type="dxa" w:w="80"/>
-              <w:right w:type="dxa" w:w="100"/>
-            </w:tcMar>
-          </w:tcPr>
-          <w:p>
-            <w:r>
-              <w:rPr>
-                <w:sz w:val="22"/>
-                <w:szCs w:val="22"/>
-              </w:rPr>
-              <w:t xml:space="preserve"/>
-            </w:r>
-          </w:p>
-        </w:tc>
-        <w:tc>
-          <w:tcPr>
-            <w:tcW w:type="dxa" w:w="1349"/>
-            <w:tcBorders>
-              <w:top w:val="single" w:color="E0E0E0" w:sz="4"/>
-              <w:left w:val="single" w:color="E0E0E0" w:sz="4"/>
-              <w:bottom w:val="single" w:color="E0E0E0" w:sz="4"/>
-              <w:right w:val="single" w:color="E0E0E0" w:sz="4"/>
-            </w:tcBorders>
-            <w:shd w:fill="FFFFFF" w:val="clear"/>
-            <w:tcMar>
-              <w:top w:type="dxa" w:w="80"/>
-              <w:left w:type="dxa" w:w="140"/>
-              <w:bottom w:type="dxa" w:w="80"/>
-              <w:right w:type="dxa" w:w="100"/>
-            </w:tcMar>
-          </w:tcPr>
-          <w:p>
-            <w:r>
-              <w:rPr>
-                <w:sz w:val="22"/>
-                <w:szCs w:val="22"/>
-              </w:rPr>
-              <w:t xml:space="preserve"/>
-            </w:r>
-          </w:p>
-        </w:tc>
-        <w:tc>
-          <w:tcPr>
-            <w:tcW w:type="dxa" w:w="3084"/>
-            <w:tcBorders>
-              <w:top w:val="single" w:color="E0E0E0" w:sz="4"/>
-              <w:left w:val="single" w:color="E0E0E0" w:sz="4"/>
-              <w:bottom w:val="single" w:color="E0E0E0" w:sz="4"/>
-              <w:right w:val="single" w:color="E0E0E0" w:sz="4"/>
-            </w:tcBorders>
-            <w:shd w:fill="FFFFFF" w:val="clear"/>
-            <w:tcMar>
-              <w:top w:type="dxa" w:w="80"/>
-              <w:left w:type="dxa" w:w="140"/>
-              <w:bottom w:type="dxa" w:w="80"/>
-              <w:right w:type="dxa" w:w="100"/>
-            </w:tcMar>
-          </w:tcPr>
-          <w:p>
-            <w:r>
-              <w:rPr>
-                <w:sz w:val="22"/>
-                <w:szCs w:val="22"/>
-              </w:rPr>
-              <w:t xml:space="preserve"/>
-            </w:r>
-          </w:p>
-        </w:tc>
-      </w:tr>
-      <w:tr>
-        <w:trPr>
-          <w:trHeight w:val="800"/>
-        </w:trPr>
-        <w:tc>
-          <w:tcPr>
-            <w:tcW w:type="dxa" w:w="1928"/>
-            <w:tcBorders>
-              <w:top w:val="single" w:color="E0E0E0" w:sz="4"/>
-              <w:left w:val="single" w:color="E0E0E0" w:sz="4"/>
-              <w:bottom w:val="single" w:color="E0E0E0" w:sz="4"/>
-              <w:right w:val="single" w:color="E0E0E0" w:sz="4"/>
-            </w:tcBorders>
-            <w:shd w:fill="F5F5F5" w:val="clear"/>
-            <w:tcMar>
-              <w:top w:type="dxa" w:w="80"/>
-              <w:left w:type="dxa" w:w="140"/>
-              <w:bottom w:type="dxa" w:w="80"/>
-              <w:right w:type="dxa" w:w="100"/>
-            </w:tcMar>
-          </w:tcPr>
-          <w:p>
-            <w:r>
-              <w:rPr>
-                <w:sz w:val="22"/>
-                <w:szCs w:val="22"/>
-              </w:rPr>
-              <w:t xml:space="preserve"/>
-            </w:r>
-          </w:p>
-        </w:tc>
-        <w:tc>
-          <w:tcPr>
-            <w:tcW w:type="dxa" w:w="3277"/>
-            <w:tcBorders>
-              <w:top w:val="single" w:color="E0E0E0" w:sz="4"/>
-              <w:left w:val="single" w:color="E0E0E0" w:sz="4"/>
-              <w:bottom w:val="single" w:color="E0E0E0" w:sz="4"/>
-              <w:right w:val="single" w:color="E0E0E0" w:sz="4"/>
-            </w:tcBorders>
-            <w:shd w:fill="F5F5F5" w:val="clear"/>
-            <w:tcMar>
-              <w:top w:type="dxa" w:w="80"/>
-              <w:left w:type="dxa" w:w="140"/>
-              <w:bottom w:type="dxa" w:w="80"/>
-              <w:right w:type="dxa" w:w="100"/>
-            </w:tcMar>
-          </w:tcPr>
-          <w:p>
-            <w:r>
-              <w:rPr>
-                <w:sz w:val="22"/>
-                <w:szCs w:val="22"/>
-              </w:rPr>
-              <w:t xml:space="preserve"/>
-            </w:r>
-          </w:p>
-        </w:tc>
-        <w:tc>
-          <w:tcPr>
-            <w:tcW w:type="dxa" w:w="1349"/>
-            <w:tcBorders>
-              <w:top w:val="single" w:color="E0E0E0" w:sz="4"/>
-              <w:left w:val="single" w:color="E0E0E0" w:sz="4"/>
-              <w:bottom w:val="single" w:color="E0E0E0" w:sz="4"/>
-              <w:right w:val="single" w:color="E0E0E0" w:sz="4"/>
-            </w:tcBorders>
-            <w:shd w:fill="F5F5F5" w:val="clear"/>
-            <w:tcMar>
-              <w:top w:type="dxa" w:w="80"/>
-              <w:left w:type="dxa" w:w="140"/>
-              <w:bottom w:type="dxa" w:w="80"/>
-              <w:right w:type="dxa" w:w="100"/>
-            </w:tcMar>
-          </w:tcPr>
-          <w:p>
-            <w:r>
-              <w:rPr>
-                <w:sz w:val="22"/>
-                <w:szCs w:val="22"/>
-              </w:rPr>
-              <w:t xml:space="preserve"/>
-            </w:r>
-          </w:p>
-        </w:tc>
-        <w:tc>
-          <w:tcPr>
-            <w:tcW w:type="dxa" w:w="3084"/>
-            <w:tcBorders>
-              <w:top w:val="single" w:color="E0E0E0" w:sz="4"/>
-              <w:left w:val="single" w:color="E0E0E0" w:sz="4"/>
-              <w:bottom w:val="single" w:color="E0E0E0" w:sz="4"/>
-              <w:right w:val="single" w:color="E0E0E0" w:sz="4"/>
-            </w:tcBorders>
-            <w:shd w:fill="F5F5F5" w:val="clear"/>
-            <w:tcMar>
-              <w:top w:type="dxa" w:w="80"/>
-              <w:left w:type="dxa" w:w="140"/>
-              <w:bottom w:type="dxa" w:w="80"/>
-              <w:right w:type="dxa" w:w="100"/>
-            </w:tcMar>
-          </w:tcPr>
-          <w:p>
-            <w:r>
-              <w:rPr>
-                <w:sz w:val="22"/>
-                <w:szCs w:val="22"/>
-              </w:rPr>
-              <w:t xml:space="preserve"/>
-            </w:r>
-          </w:p>
-        </w:tc>
-      </w:tr>
-      <w:tr>
-        <w:trPr>
-          <w:trHeight w:val="800"/>
-        </w:trPr>
-        <w:tc>
-          <w:tcPr>
-            <w:tcW w:type="dxa" w:w="1928"/>
-            <w:tcBorders>
-              <w:top w:val="single" w:color="E0E0E0" w:sz="4"/>
-              <w:left w:val="single" w:color="E0E0E0" w:sz="4"/>
-              <w:bottom w:val="single" w:color="E0E0E0" w:sz="4"/>
-              <w:right w:val="single" w:color="E0E0E0" w:sz="4"/>
-            </w:tcBorders>
-            <w:shd w:fill="FFFFFF" w:val="clear"/>
-            <w:tcMar>
-              <w:top w:type="dxa" w:w="80"/>
-              <w:left w:type="dxa" w:w="140"/>
-              <w:bottom w:type="dxa" w:w="80"/>
-              <w:right w:type="dxa" w:w="100"/>
-            </w:tcMar>
-          </w:tcPr>
-          <w:p>
-            <w:r>
-              <w:rPr>
-                <w:sz w:val="22"/>
-                <w:szCs w:val="22"/>
-              </w:rPr>
-              <w:t xml:space="preserve"/>
-            </w:r>
-          </w:p>
-        </w:tc>
-        <w:tc>
-          <w:tcPr>
-            <w:tcW w:type="dxa" w:w="3277"/>
-            <w:tcBorders>
-              <w:top w:val="single" w:color="E0E0E0" w:sz="4"/>
-              <w:left w:val="single" w:color="E0E0E0" w:sz="4"/>
-              <w:bottom w:val="single" w:color="E0E0E0" w:sz="4"/>
-              <w:right w:val="single" w:color="E0E0E0" w:sz="4"/>
-            </w:tcBorders>
-            <w:shd w:fill="FFFFFF" w:val="clear"/>
-            <w:tcMar>
-              <w:top w:type="dxa" w:w="80"/>
-              <w:left w:type="dxa" w:w="140"/>
-              <w:bottom w:type="dxa" w:w="80"/>
-              <w:right w:type="dxa" w:w="100"/>
-            </w:tcMar>
-          </w:tcPr>
-          <w:p>
-            <w:r>
-              <w:rPr>
-                <w:sz w:val="22"/>
-                <w:szCs w:val="22"/>
-              </w:rPr>
-              <w:t xml:space="preserve"/>
-            </w:r>
-          </w:p>
-        </w:tc>
-        <w:tc>
-          <w:tcPr>
-            <w:tcW w:type="dxa" w:w="1349"/>
-            <w:tcBorders>
-              <w:top w:val="single" w:color="E0E0E0" w:sz="4"/>
-              <w:left w:val="single" w:color="E0E0E0" w:sz="4"/>
-              <w:bottom w:val="single" w:color="E0E0E0" w:sz="4"/>
-              <w:right w:val="single" w:color="E0E0E0" w:sz="4"/>
-            </w:tcBorders>
-            <w:shd w:fill="FFFFFF" w:val="clear"/>
-            <w:tcMar>
-              <w:top w:type="dxa" w:w="80"/>
-              <w:left w:type="dxa" w:w="140"/>
-              <w:bottom w:type="dxa" w:w="80"/>
-              <w:right w:type="dxa" w:w="100"/>
-            </w:tcMar>
-          </w:tcPr>
-          <w:p>
-            <w:r>
-              <w:rPr>
-                <w:sz w:val="22"/>
-                <w:szCs w:val="22"/>
-              </w:rPr>
-              <w:t xml:space="preserve"/>
-            </w:r>
-          </w:p>
-        </w:tc>
-        <w:tc>
-          <w:tcPr>
-            <w:tcW w:type="dxa" w:w="3084"/>
-            <w:tcBorders>
-              <w:top w:val="single" w:color="E0E0E0" w:sz="4"/>
-              <w:left w:val="single" w:color="E0E0E0" w:sz="4"/>
-              <w:bottom w:val="single" w:color="E0E0E0" w:sz="4"/>
-              <w:right w:val="single" w:color="E0E0E0" w:sz="4"/>
-            </w:tcBorders>
-            <w:shd w:fill="FFFFFF" w:val="clear"/>
-            <w:tcMar>
-              <w:top w:type="dxa" w:w="80"/>
-              <w:left w:type="dxa" w:w="140"/>
-              <w:bottom w:type="dxa" w:w="80"/>
-              <w:right w:type="dxa" w:w="100"/>
-            </w:tcMar>
-          </w:tcPr>
-          <w:p>
-            <w:r>
-              <w:rPr>
-                <w:sz w:val="22"/>
-                <w:szCs w:val="22"/>
-              </w:rPr>
-              <w:t xml:space="preserve"/>
-            </w:r>
-          </w:p>
-        </w:tc>
-      </w:tr>
-      <w:tr>
-        <w:trPr>
-          <w:trHeight w:val="800"/>
-        </w:trPr>
-        <w:tc>
-          <w:tcPr>
-            <w:tcW w:type="dxa" w:w="1928"/>
-            <w:tcBorders>
-              <w:top w:val="single" w:color="E0E0E0" w:sz="4"/>
-              <w:left w:val="single" w:color="E0E0E0" w:sz="4"/>
-              <w:bottom w:val="single" w:color="E0E0E0" w:sz="4"/>
-              <w:right w:val="single" w:color="E0E0E0" w:sz="4"/>
-            </w:tcBorders>
-            <w:shd w:fill="F5F5F5" w:val="clear"/>
-            <w:tcMar>
-              <w:top w:type="dxa" w:w="80"/>
-              <w:left w:type="dxa" w:w="140"/>
-              <w:bottom w:type="dxa" w:w="80"/>
-              <w:right w:type="dxa" w:w="100"/>
-            </w:tcMar>
-          </w:tcPr>
-          <w:p>
-            <w:r>
-              <w:rPr>
-                <w:sz w:val="22"/>
-                <w:szCs w:val="22"/>
-              </w:rPr>
-              <w:t xml:space="preserve"/>
-            </w:r>
-          </w:p>
-        </w:tc>
-        <w:tc>
-          <w:tcPr>
-            <w:tcW w:type="dxa" w:w="3277"/>
-            <w:tcBorders>
-              <w:top w:val="single" w:color="E0E0E0" w:sz="4"/>
-              <w:left w:val="single" w:color="E0E0E0" w:sz="4"/>
-              <w:bottom w:val="single" w:color="E0E0E0" w:sz="4"/>
-              <w:right w:val="single" w:color="E0E0E0" w:sz="4"/>
-            </w:tcBorders>
-            <w:shd w:fill="F5F5F5" w:val="clear"/>
-            <w:tcMar>
-              <w:top w:type="dxa" w:w="80"/>
-              <w:left w:type="dxa" w:w="140"/>
-              <w:bottom w:type="dxa" w:w="80"/>
-              <w:right w:type="dxa" w:w="100"/>
-            </w:tcMar>
-          </w:tcPr>
-          <w:p>
-            <w:r>
-              <w:rPr>
-                <w:sz w:val="22"/>
-                <w:szCs w:val="22"/>
-              </w:rPr>
-              <w:t xml:space="preserve"/>
-            </w:r>
-          </w:p>
-        </w:tc>
-        <w:tc>
-          <w:tcPr>
-            <w:tcW w:type="dxa" w:w="1349"/>
-            <w:tcBorders>
-              <w:top w:val="single" w:color="E0E0E0" w:sz="4"/>
-              <w:left w:val="single" w:color="E0E0E0" w:sz="4"/>
-              <w:bottom w:val="single" w:color="E0E0E0" w:sz="4"/>
-              <w:right w:val="single" w:color="E0E0E0" w:sz="4"/>
-            </w:tcBorders>
-            <w:shd w:fill="F5F5F5" w:val="clear"/>
-            <w:tcMar>
-              <w:top w:type="dxa" w:w="80"/>
-              <w:left w:type="dxa" w:w="140"/>
-              <w:bottom w:type="dxa" w:w="80"/>
-              <w:right w:type="dxa" w:w="100"/>
-            </w:tcMar>
-          </w:tcPr>
-          <w:p>
-            <w:r>
-              <w:rPr>
-                <w:sz w:val="22"/>
-                <w:szCs w:val="22"/>
-              </w:rPr>
-              <w:t xml:space="preserve"/>
-            </w:r>
-          </w:p>
-        </w:tc>
-        <w:tc>
-          <w:tcPr>
-            <w:tcW w:type="dxa" w:w="3084"/>
-            <w:tcBorders>
-              <w:top w:val="single" w:color="E0E0E0" w:sz="4"/>
-              <w:left w:val="single" w:color="E0E0E0" w:sz="4"/>
-              <w:bottom w:val="single" w:color="E0E0E0" w:sz="4"/>
-              <w:right w:val="single" w:color="E0E0E0" w:sz="4"/>
-            </w:tcBorders>
-            <w:shd w:fill="F5F5F5" w:val="clear"/>
-            <w:tcMar>
-              <w:top w:type="dxa" w:w="80"/>
-              <w:left w:type="dxa" w:w="140"/>
-              <w:bottom w:type="dxa" w:w="80"/>
-              <w:right w:type="dxa" w:w="100"/>
-            </w:tcMar>
-          </w:tcPr>
-          <w:p>
-            <w:r>
-              <w:rPr>
-                <w:sz w:val="22"/>
-                <w:szCs w:val="22"/>
-              </w:rPr>
-              <w:t xml:space="preserve"/>
-            </w:r>
-          </w:p>
-        </w:tc>
-      </w:tr>
-      <w:tr>
-        <w:trPr>
-          <w:trHeight w:val="800"/>
-        </w:trPr>
-        <w:tc>
-          <w:tcPr>
-            <w:tcW w:type="dxa" w:w="1928"/>
-            <w:tcBorders>
-              <w:top w:val="single" w:color="E0E0E0" w:sz="4"/>
-              <w:left w:val="single" w:color="E0E0E0" w:sz="4"/>
-              <w:bottom w:val="single" w:color="E0E0E0" w:sz="4"/>
-              <w:right w:val="single" w:color="E0E0E0" w:sz="4"/>
-            </w:tcBorders>
-            <w:shd w:fill="FFFFFF" w:val="clear"/>
-            <w:tcMar>
-              <w:top w:type="dxa" w:w="80"/>
-              <w:left w:type="dxa" w:w="140"/>
-              <w:bottom w:type="dxa" w:w="80"/>
-              <w:right w:type="dxa" w:w="100"/>
-            </w:tcMar>
-          </w:tcPr>
-          <w:p>
-            <w:r>
-              <w:rPr>
-                <w:sz w:val="22"/>
-                <w:szCs w:val="22"/>
-              </w:rPr>
-              <w:t xml:space="preserve"/>
-            </w:r>
-          </w:p>
-        </w:tc>
-        <w:tc>
-          <w:tcPr>
-            <w:tcW w:type="dxa" w:w="3277"/>
-            <w:tcBorders>
-              <w:top w:val="single" w:color="E0E0E0" w:sz="4"/>
-              <w:left w:val="single" w:color="E0E0E0" w:sz="4"/>
-              <w:bottom w:val="single" w:color="E0E0E0" w:sz="4"/>
-              <w:right w:val="single" w:color="E0E0E0" w:sz="4"/>
-            </w:tcBorders>
-            <w:shd w:fill="FFFFFF" w:val="clear"/>
-            <w:tcMar>
-              <w:top w:type="dxa" w:w="80"/>
-              <w:left w:type="dxa" w:w="140"/>
-              <w:bottom w:type="dxa" w:w="80"/>
-              <w:right w:type="dxa" w:w="100"/>
-            </w:tcMar>
-          </w:tcPr>
-          <w:p>
-            <w:r>
-              <w:rPr>
-                <w:sz w:val="22"/>
-                <w:szCs w:val="22"/>
-              </w:rPr>
-              <w:t xml:space="preserve"/>
-            </w:r>
-          </w:p>
-        </w:tc>
-        <w:tc>
-          <w:tcPr>
-            <w:tcW w:type="dxa" w:w="1349"/>
-            <w:tcBorders>
-              <w:top w:val="single" w:color="E0E0E0" w:sz="4"/>
-              <w:left w:val="single" w:color="E0E0E0" w:sz="4"/>
-              <w:bottom w:val="single" w:color="E0E0E0" w:sz="4"/>
-              <w:right w:val="single" w:color="E0E0E0" w:sz="4"/>
-            </w:tcBorders>
-            <w:shd w:fill="FFFFFF" w:val="clear"/>
-            <w:tcMar>
-              <w:top w:type="dxa" w:w="80"/>
-              <w:left w:type="dxa" w:w="140"/>
-              <w:bottom w:type="dxa" w:w="80"/>
-              <w:right w:type="dxa" w:w="100"/>
-            </w:tcMar>
-          </w:tcPr>
-          <w:p>
-            <w:r>
-              <w:rPr>
-                <w:sz w:val="22"/>
-                <w:szCs w:val="22"/>
-              </w:rPr>
-              <w:t xml:space="preserve"/>
-            </w:r>
-          </w:p>
-        </w:tc>
-        <w:tc>
-          <w:tcPr>
-            <w:tcW w:type="dxa" w:w="3084"/>
-            <w:tcBorders>
-              <w:top w:val="single" w:color="E0E0E0" w:sz="4"/>
-              <w:left w:val="single" w:color="E0E0E0" w:sz="4"/>
-              <w:bottom w:val="single" w:color="E0E0E0" w:sz="4"/>
-              <w:right w:val="single" w:color="E0E0E0" w:sz="4"/>
-            </w:tcBorders>
-            <w:shd w:fill="FFFFFF" w:val="clear"/>
-            <w:tcMar>
-              <w:top w:type="dxa" w:w="80"/>
-              <w:left w:type="dxa" w:w="140"/>
-              <w:bottom w:type="dxa" w:w="80"/>
-              <w:right w:type="dxa" w:w="100"/>
-            </w:tcMar>
-          </w:tcPr>
-          <w:p>
-            <w:r>
-              <w:rPr>
-                <w:sz w:val="22"/>
-                <w:szCs w:val="22"/>
-              </w:rPr>
-              <w:t xml:space="preserve"/>
-            </w:r>
-          </w:p>
-        </w:tc>
-      </w:tr>
-      <w:tr>
-        <w:trPr>
-          <w:trHeight w:val="800"/>
-        </w:trPr>
-        <w:tc>
-          <w:tcPr>
-            <w:tcW w:type="dxa" w:w="1928"/>
-            <w:tcBorders>
-              <w:top w:val="single" w:color="E0E0E0" w:sz="4"/>
-              <w:left w:val="single" w:color="E0E0E0" w:sz="4"/>
-              <w:bottom w:val="single" w:color="E0E0E0" w:sz="4"/>
-              <w:right w:val="single" w:color="E0E0E0" w:sz="4"/>
-            </w:tcBorders>
-            <w:shd w:fill="F5F5F5" w:val="clear"/>
-            <w:tcMar>
-              <w:top w:type="dxa" w:w="80"/>
-              <w:left w:type="dxa" w:w="140"/>
-              <w:bottom w:type="dxa" w:w="80"/>
-              <w:right w:type="dxa" w:w="100"/>
-            </w:tcMar>
-          </w:tcPr>
-          <w:p>
-            <w:r>
-              <w:rPr>
-                <w:sz w:val="22"/>
-                <w:szCs w:val="22"/>
-              </w:rPr>
-              <w:t xml:space="preserve"/>
-            </w:r>
-          </w:p>
-        </w:tc>
-        <w:tc>
-          <w:tcPr>
-            <w:tcW w:type="dxa" w:w="3277"/>
-            <w:tcBorders>
-              <w:top w:val="single" w:color="E0E0E0" w:sz="4"/>
-              <w:left w:val="single" w:color="E0E0E0" w:sz="4"/>
-              <w:bottom w:val="single" w:color="E0E0E0" w:sz="4"/>
-              <w:right w:val="single" w:color="E0E0E0" w:sz="4"/>
-            </w:tcBorders>
-            <w:shd w:fill="F5F5F5" w:val="clear"/>
-            <w:tcMar>
-              <w:top w:type="dxa" w:w="80"/>
-              <w:left w:type="dxa" w:w="140"/>
-              <w:bottom w:type="dxa" w:w="80"/>
-              <w:right w:type="dxa" w:w="100"/>
-            </w:tcMar>
-          </w:tcPr>
-          <w:p>
-            <w:r>
-              <w:rPr>
-                <w:sz w:val="22"/>
-                <w:szCs w:val="22"/>
-              </w:rPr>
-              <w:t xml:space="preserve"/>
-            </w:r>
-          </w:p>
-        </w:tc>
-        <w:tc>
-          <w:tcPr>
-            <w:tcW w:type="dxa" w:w="1349"/>
-            <w:tcBorders>
-              <w:top w:val="single" w:color="E0E0E0" w:sz="4"/>
-              <w:left w:val="single" w:color="E0E0E0" w:sz="4"/>
-              <w:bottom w:val="single" w:color="E0E0E0" w:sz="4"/>
-              <w:right w:val="single" w:color="E0E0E0" w:sz="4"/>
-            </w:tcBorders>
-            <w:shd w:fill="F5F5F5" w:val="clear"/>
-            <w:tcMar>
-              <w:top w:type="dxa" w:w="80"/>
-              <w:left w:type="dxa" w:w="140"/>
-              <w:bottom w:type="dxa" w:w="80"/>
-              <w:right w:type="dxa" w:w="100"/>
-            </w:tcMar>
-          </w:tcPr>
-          <w:p>
-            <w:r>
-              <w:rPr>
-                <w:sz w:val="22"/>
-                <w:szCs w:val="22"/>
-              </w:rPr>
-              <w:t xml:space="preserve"/>
-            </w:r>
-          </w:p>
-        </w:tc>
-        <w:tc>
-          <w:tcPr>
-            <w:tcW w:type="dxa" w:w="3084"/>
-            <w:tcBorders>
-              <w:top w:val="single" w:color="E0E0E0" w:sz="4"/>
-              <w:left w:val="single" w:color="E0E0E0" w:sz="4"/>
-              <w:bottom w:val="single" w:color="E0E0E0" w:sz="4"/>
-              <w:right w:val="single" w:color="E0E0E0" w:sz="4"/>
-            </w:tcBorders>
-            <w:shd w:fill="F5F5F5" w:val="clear"/>
-            <w:tcMar>
-              <w:top w:type="dxa" w:w="80"/>
-              <w:left w:type="dxa" w:w="140"/>
-              <w:bottom w:type="dxa" w:w="80"/>
-              <w:right w:type="dxa" w:w="100"/>
-            </w:tcMar>
-          </w:tcPr>
-          <w:p>
-            <w:r>
-              <w:rPr>
-                <w:sz w:val="22"/>
-                <w:szCs w:val="22"/>
-              </w:rPr>
-              <w:t xml:space="preserve"/>
-            </w:r>
-          </w:p>
-        </w:tc>
-      </w:tr>
-      <w:tr>
-        <w:trPr>
-          <w:trHeight w:val="800"/>
-        </w:trPr>
-        <w:tc>
-          <w:tcPr>
-            <w:tcW w:type="dxa" w:w="1928"/>
-            <w:tcBorders>
-              <w:top w:val="single" w:color="E0E0E0" w:sz="4"/>
-              <w:left w:val="single" w:color="E0E0E0" w:sz="4"/>
-              <w:bottom w:val="single" w:color="E0E0E0" w:sz="4"/>
-              <w:right w:val="single" w:color="E0E0E0" w:sz="4"/>
-            </w:tcBorders>
-            <w:shd w:fill="FFFFFF" w:val="clear"/>
-            <w:tcMar>
-              <w:top w:type="dxa" w:w="80"/>
-              <w:left w:type="dxa" w:w="140"/>
-              <w:bottom w:type="dxa" w:w="80"/>
-              <w:right w:type="dxa" w:w="100"/>
-            </w:tcMar>
-          </w:tcPr>
-          <w:p>
-            <w:r>
-              <w:rPr>
-                <w:sz w:val="22"/>
-                <w:szCs w:val="22"/>
-              </w:rPr>
-              <w:t xml:space="preserve"/>
-            </w:r>
-          </w:p>
-        </w:tc>
-        <w:tc>
-          <w:tcPr>
-            <w:tcW w:type="dxa" w:w="3277"/>
-            <w:tcBorders>
-              <w:top w:val="single" w:color="E0E0E0" w:sz="4"/>
-              <w:left w:val="single" w:color="E0E0E0" w:sz="4"/>
-              <w:bottom w:val="single" w:color="E0E0E0" w:sz="4"/>
-              <w:right w:val="single" w:color="E0E0E0" w:sz="4"/>
-            </w:tcBorders>
-            <w:shd w:fill="FFFFFF" w:val="clear"/>
-            <w:tcMar>
-              <w:top w:type="dxa" w:w="80"/>
-              <w:left w:type="dxa" w:w="140"/>
-              <w:bottom w:type="dxa" w:w="80"/>
-              <w:right w:type="dxa" w:w="100"/>
-            </w:tcMar>
-          </w:tcPr>
-          <w:p>
-            <w:r>
-              <w:rPr>
-                <w:sz w:val="22"/>
-                <w:szCs w:val="22"/>
-              </w:rPr>
-              <w:t xml:space="preserve"/>
-            </w:r>
-          </w:p>
-        </w:tc>
-        <w:tc>
-          <w:tcPr>
-            <w:tcW w:type="dxa" w:w="1349"/>
-            <w:tcBorders>
-              <w:top w:val="single" w:color="E0E0E0" w:sz="4"/>
-              <w:left w:val="single" w:color="E0E0E0" w:sz="4"/>
-              <w:bottom w:val="single" w:color="E0E0E0" w:sz="4"/>
-              <w:right w:val="single" w:color="E0E0E0" w:sz="4"/>
-            </w:tcBorders>
-            <w:shd w:fill="FFFFFF" w:val="clear"/>
-            <w:tcMar>
-              <w:top w:type="dxa" w:w="80"/>
-              <w:left w:type="dxa" w:w="140"/>
-              <w:bottom w:type="dxa" w:w="80"/>
-              <w:right w:type="dxa" w:w="100"/>
-            </w:tcMar>
-          </w:tcPr>
-          <w:p>
-            <w:r>
-              <w:rPr>
-                <w:sz w:val="22"/>
-                <w:szCs w:val="22"/>
-              </w:rPr>
-              <w:t xml:space="preserve"/>
-            </w:r>
-          </w:p>
-        </w:tc>
-        <w:tc>
-          <w:tcPr>
-            <w:tcW w:type="dxa" w:w="3084"/>
-            <w:tcBorders>
-              <w:top w:val="single" w:color="E0E0E0" w:sz="4"/>
-              <w:left w:val="single" w:color="E0E0E0" w:sz="4"/>
-              <w:bottom w:val="single" w:color="E0E0E0" w:sz="4"/>
-              <w:right w:val="single" w:color="E0E0E0" w:sz="4"/>
-            </w:tcBorders>
-            <w:shd w:fill="FFFFFF" w:val="clear"/>
-            <w:tcMar>
-              <w:top w:type="dxa" w:w="80"/>
-              <w:left w:type="dxa" w:w="140"/>
-              <w:bottom w:type="dxa" w:w="80"/>
-              <w:right w:type="dxa" w:w="100"/>
-            </w:tcMar>
-          </w:tcPr>
-          <w:p>
-            <w:r>
-              <w:rPr>
-                <w:sz w:val="22"/>
-                <w:szCs w:val="22"/>
-              </w:rPr>
-              <w:t xml:space="preserve"/>
-            </w:r>
-          </w:p>
-        </w:tc>
-      </w:tr>
-      <w:tr>
-        <w:trPr>
-          <w:trHeight w:val="800"/>
-        </w:trPr>
-        <w:tc>
-          <w:tcPr>
-            <w:tcW w:type="dxa" w:w="1928"/>
-            <w:tcBorders>
-              <w:top w:val="single" w:color="E0E0E0" w:sz="4"/>
-              <w:left w:val="single" w:color="E0E0E0" w:sz="4"/>
-              <w:bottom w:val="single" w:color="E0E0E0" w:sz="4"/>
-              <w:right w:val="single" w:color="E0E0E0" w:sz="4"/>
-            </w:tcBorders>
-            <w:shd w:fill="F5F5F5" w:val="clear"/>
-            <w:tcMar>
-              <w:top w:type="dxa" w:w="80"/>
-              <w:left w:type="dxa" w:w="140"/>
-              <w:bottom w:type="dxa" w:w="80"/>
-              <w:right w:type="dxa" w:w="100"/>
-            </w:tcMar>
-          </w:tcPr>
-          <w:p>
-            <w:r>
-              <w:rPr>
-                <w:sz w:val="22"/>
-                <w:szCs w:val="22"/>
-              </w:rPr>
-              <w:t xml:space="preserve"/>
-            </w:r>
-          </w:p>
-        </w:tc>
-        <w:tc>
-          <w:tcPr>
-            <w:tcW w:type="dxa" w:w="3277"/>
-            <w:tcBorders>
-              <w:top w:val="single" w:color="E0E0E0" w:sz="4"/>
-              <w:left w:val="single" w:color="E0E0E0" w:sz="4"/>
-              <w:bottom w:val="single" w:color="E0E0E0" w:sz="4"/>
-              <w:right w:val="single" w:color="E0E0E0" w:sz="4"/>
-            </w:tcBorders>
-            <w:shd w:fill="F5F5F5" w:val="clear"/>
-            <w:tcMar>
-              <w:top w:type="dxa" w:w="80"/>
-              <w:left w:type="dxa" w:w="140"/>
-              <w:bottom w:type="dxa" w:w="80"/>
-              <w:right w:type="dxa" w:w="100"/>
-            </w:tcMar>
-          </w:tcPr>
-          <w:p>
-            <w:r>
-              <w:rPr>
-                <w:sz w:val="22"/>
-                <w:szCs w:val="22"/>
-              </w:rPr>
-              <w:t xml:space="preserve"/>
-            </w:r>
-          </w:p>
-        </w:tc>
-        <w:tc>
-          <w:tcPr>
-            <w:tcW w:type="dxa" w:w="1349"/>
-            <w:tcBorders>
-              <w:top w:val="single" w:color="E0E0E0" w:sz="4"/>
-              <w:left w:val="single" w:color="E0E0E0" w:sz="4"/>
-              <w:bottom w:val="single" w:color="E0E0E0" w:sz="4"/>
-              <w:right w:val="single" w:color="E0E0E0" w:sz="4"/>
-            </w:tcBorders>
-            <w:shd w:fill="F5F5F5" w:val="clear"/>
-            <w:tcMar>
-              <w:top w:type="dxa" w:w="80"/>
-              <w:left w:type="dxa" w:w="140"/>
-              <w:bottom w:type="dxa" w:w="80"/>
-              <w:right w:type="dxa" w:w="100"/>
-            </w:tcMar>
-          </w:tcPr>
-          <w:p>
-            <w:r>
-              <w:rPr>
-                <w:sz w:val="22"/>
-                <w:szCs w:val="22"/>
-              </w:rPr>
-              <w:t xml:space="preserve"/>
-            </w:r>
-          </w:p>
-        </w:tc>
-        <w:tc>
-          <w:tcPr>
-            <w:tcW w:type="dxa" w:w="3084"/>
-            <w:tcBorders>
-              <w:top w:val="single" w:color="E0E0E0" w:sz="4"/>
-              <w:left w:val="single" w:color="E0E0E0" w:sz="4"/>
-              <w:bottom w:val="single" w:color="E0E0E0" w:sz="4"/>
-              <w:right w:val="single" w:color="E0E0E0" w:sz="4"/>
-            </w:tcBorders>
-            <w:shd w:fill="F5F5F5" w:val="clear"/>
-            <w:tcMar>
-              <w:top w:type="dxa" w:w="80"/>
-              <w:left w:type="dxa" w:w="140"/>
-              <w:bottom w:type="dxa" w:w="80"/>
-              <w:right w:type="dxa" w:w="100"/>
-            </w:tcMar>
-          </w:tcPr>
-          <w:p>
-            <w:r>
-              <w:rPr>
-                <w:sz w:val="22"/>
-                <w:szCs w:val="22"/>
-              </w:rPr>
-              <w:t xml:space="preserve"/>
-            </w:r>
-          </w:p>
-        </w:tc>
-      </w:tr>
-    </w:tbl>
-    <w:p>
-      <w:pPr>
-        <w:spacing w:after="200"/>
-      </w:pPr>
-    </w:p>
-    <w:p>
-      <w:r>
-        <w:br w:type="page"/>
-      </w:r>
-    </w:p>
-    <w:p>
-      <w:pPr>
-        <w:pBdr>
-          <w:bottom w:val="single" w:color="FFA000" w:sz="4" w:space="1"/>
-        </w:pBdr>
-        <w:spacing w:after="120" w:before="240"/>
-      </w:pPr>
-      <w:r>
-        <w:rPr>
-          <w:rFonts w:ascii="Arial" w:cs="Arial" w:eastAsia="Arial" w:hAnsi="Arial"/>
-          <w:b/>
-          <w:bCs/>
-          <w:color w:val="3949AB"/>
-          <w:sz w:val="24"/>
-          <w:szCs w:val="24"/>
-        </w:rPr>
-        <w:t xml:space="preserve">Paso 2 — Audita los dos buckets que siguen vivos</w:t>
-      </w:r>
-    </w:p>
-    <w:p>
-      <w:pPr>
-        <w:spacing w:after="100"/>
-      </w:pPr>
-      <w:r>
-        <w:rPr>
-          <w:rFonts w:ascii="Arial" w:cs="Arial" w:eastAsia="Arial" w:hAnsi="Arial"/>
-          <w:color w:val="212121"/>
-          <w:sz w:val="22"/>
-          <w:szCs w:val="22"/>
-        </w:rPr>
-        <w:t xml:space="preserve">Tus predicciones antes de ejecutar los comandos (acceso público, versionado, cifrado, reglas de ciclo de vida, para cada bucket):</w:t>
-      </w:r>
-    </w:p>
-    <w:tbl>
-      <w:tblPr>
-        <w:tblW w:type="dxa" w:w="9638"/>
-        <w:tblBorders>
-          <w:top w:val="single" w:color="auto" w:sz="4"/>
-          <w:left w:val="single" w:color="auto" w:sz="4"/>
-          <w:bottom w:val="single" w:color="auto" w:sz="4"/>
-          <w:right w:val="single" w:color="auto" w:sz="4"/>
-          <w:insideH w:val="single" w:color="auto" w:sz="4"/>
-          <w:insideV w:val="single" w:color="auto" w:sz="4"/>
-        </w:tblBorders>
-      </w:tblPr>
-      <w:tblGrid>
-        <w:gridCol w:w="9638"/>
-      </w:tblGrid>
-      <w:tr>
-        <w:trPr>
-          <w:trHeight w:val="480"/>
-        </w:trPr>
-        <w:tc>
-          <w:tcPr>
-            <w:tcW w:type="dxa" w:w="9638"/>
-            <w:tcBorders>
-              <w:top w:val="single" w:color="E0E0E0" w:sz="4"/>
-              <w:left w:val="single" w:color="E0E0E0" w:sz="4"/>
-              <w:bottom w:val="single" w:color="E0E0E0" w:sz="4"/>
-              <w:right w:val="single" w:color="E0E0E0" w:sz="4"/>
-            </w:tcBorders>
-            <w:shd w:fill="FAFAFA" w:val="clear"/>
-            <w:tcMar>
-              <w:top w:type="dxa" w:w="60"/>
-              <w:left w:type="dxa" w:w="160"/>
-              <w:bottom w:type="dxa" w:w="60"/>
-              <w:right w:type="dxa" w:w="160"/>
-            </w:tcMar>
-          </w:tcPr>
-          <w:p>
-            <w:r>
-              <w:rPr>
-                <w:sz w:val="22"/>
-                <w:szCs w:val="22"/>
-              </w:rPr>
-              <w:t xml:space="preserve"/>
-            </w:r>
-          </w:p>
-        </w:tc>
-      </w:tr>
-      <w:tr>
-        <w:trPr>
-          <w:trHeight w:val="480"/>
-        </w:trPr>
-        <w:tc>
-          <w:tcPr>
-            <w:tcW w:type="dxa" w:w="9638"/>
-            <w:tcBorders>
-              <w:top w:val="single" w:color="E0E0E0" w:sz="4"/>
-              <w:left w:val="single" w:color="E0E0E0" w:sz="4"/>
-              <w:bottom w:val="single" w:color="E0E0E0" w:sz="4"/>
-              <w:right w:val="single" w:color="E0E0E0" w:sz="4"/>
-            </w:tcBorders>
-            <w:shd w:fill="FAFAFA" w:val="clear"/>
-            <w:tcMar>
-              <w:top w:type="dxa" w:w="60"/>
-              <w:left w:type="dxa" w:w="160"/>
-              <w:bottom w:type="dxa" w:w="60"/>
-              <w:right w:type="dxa" w:w="160"/>
-            </w:tcMar>
-          </w:tcPr>
-          <w:p>
-            <w:r>
-              <w:rPr>
-                <w:sz w:val="22"/>
-                <w:szCs w:val="22"/>
-              </w:rPr>
-              <w:t xml:space="preserve"/>
-            </w:r>
-          </w:p>
-        </w:tc>
-      </w:tr>
-      <w:tr>
-        <w:trPr>
-          <w:trHeight w:val="480"/>
-        </w:trPr>
-        <w:tc>
-          <w:tcPr>
-            <w:tcW w:type="dxa" w:w="9638"/>
-            <w:tcBorders>
-              <w:top w:val="single" w:color="E0E0E0" w:sz="4"/>
-              <w:left w:val="single" w:color="E0E0E0" w:sz="4"/>
-              <w:bottom w:val="single" w:color="E0E0E0" w:sz="4"/>
-              <w:right w:val="single" w:color="E0E0E0" w:sz="4"/>
-            </w:tcBorders>
-            <w:shd w:fill="FAFAFA" w:val="clear"/>
-            <w:tcMar>
-              <w:top w:type="dxa" w:w="60"/>
-              <w:left w:type="dxa" w:w="160"/>
-              <w:bottom w:type="dxa" w:w="60"/>
-              <w:right w:type="dxa" w:w="160"/>
-            </w:tcMar>
-          </w:tcPr>
-          <w:p>
-            <w:r>
-              <w:rPr>
-                <w:sz w:val="22"/>
-                <w:szCs w:val="22"/>
-              </w:rPr>
-              <w:t xml:space="preserve"/>
-            </w:r>
-          </w:p>
-        </w:tc>
-      </w:tr>
-      <w:tr>
-        <w:trPr>
-          <w:trHeight w:val="480"/>
-        </w:trPr>
-        <w:tc>
-          <w:tcPr>
-            <w:tcW w:type="dxa" w:w="9638"/>
-            <w:tcBorders>
-              <w:top w:val="single" w:color="E0E0E0" w:sz="4"/>
-              <w:left w:val="single" w:color="E0E0E0" w:sz="4"/>
-              <w:bottom w:val="single" w:color="E0E0E0" w:sz="4"/>
-              <w:right w:val="single" w:color="E0E0E0" w:sz="4"/>
-            </w:tcBorders>
-            <w:shd w:fill="FAFAFA" w:val="clear"/>
-            <w:tcMar>
-              <w:top w:type="dxa" w:w="60"/>
-              <w:left w:type="dxa" w:w="160"/>
-              <w:bottom w:type="dxa" w:w="60"/>
-              <w:right w:type="dxa" w:w="160"/>
-            </w:tcMar>
-          </w:tcPr>
-          <w:p>
-            <w:r>
-              <w:rPr>
-                <w:sz w:val="22"/>
-                <w:szCs w:val="22"/>
-              </w:rPr>
-              <w:t xml:space="preserve"/>
-            </w:r>
-          </w:p>
-        </w:tc>
-      </w:tr>
-    </w:tbl>
-    <w:p>
-      <w:pPr>
-        <w:spacing w:after="120"/>
-      </w:pPr>
-    </w:p>
-    <w:tbl>
-      <w:tblPr>
-        <w:tblW w:type="dxa" w:w="9638"/>
-        <w:tblBorders>
-          <w:top w:val="single" w:color="auto" w:sz="4"/>
-          <w:left w:val="single" w:color="auto" w:sz="4"/>
-          <w:bottom w:val="single" w:color="auto" w:sz="4"/>
-          <w:right w:val="single" w:color="auto" w:sz="4"/>
-          <w:insideH w:val="single" w:color="auto" w:sz="4"/>
-          <w:insideV w:val="single" w:color="auto" w:sz="4"/>
-        </w:tblBorders>
-      </w:tblPr>
-      <w:tblGrid>
-        <w:gridCol w:w="9638"/>
-      </w:tblGrid>
-      <w:tr>
-        <w:tc>
-          <w:tcPr>
-            <w:tcW w:type="dxa" w:w="9638"/>
-            <w:tcBorders>
-              <w:top w:val="none" w:color="FFFFFF" w:sz="0"/>
-              <w:left w:val="none" w:color="FFFFFF" w:sz="0"/>
-              <w:bottom w:val="none" w:color="FFFFFF" w:sz="0"/>
-              <w:right w:val="none" w:color="FFFFFF" w:sz="0"/>
+              <w:t xml:space="preserve">Impacto</w:t>
+            </w:r>
+          </w:p>
+        </w:tc>
+        <w:tc>
+          <w:tcPr>
+            <w:tcW w:type="dxa" w:w="1735"/>
+            <w:tcBorders>
+              <w:top w:val="single" w:color="E0E0E0" w:sz="4"/>
+              <w:left w:val="single" w:color="E0E0E0" w:sz="4"/>
+              <w:bottom w:val="single" w:color="E0E0E0" w:sz="4"/>
+              <w:right w:val="single" w:color="E0E0E0" w:sz="4"/>
             </w:tcBorders>
             <w:shd w:fill="3949AB" w:val="clear"/>
             <w:tcMar>
-              <w:top w:type="dxa" w:w="80"/>
-              <w:left w:type="dxa" w:w="160"/>
-              <w:bottom w:type="dxa" w:w="80"/>
-              <w:right w:type="dxa" w:w="160"/>
-            </w:tcMar>
-          </w:tcPr>
-          <w:p>
+              <w:top w:type="dxa" w:w="100"/>
+              <w:left w:type="dxa" w:w="140"/>
+              <w:bottom w:type="dxa" w:w="100"/>
+              <w:right w:type="dxa" w:w="100"/>
+            </w:tcMar>
+          </w:tcPr>
+          <w:p>
+            <w:pPr>
+              <w:jc w:val="center"/>
+            </w:pPr>
             <w:r>
               <w:rPr>
                 <w:rFonts w:ascii="Arial" w:cs="Arial" w:eastAsia="Arial" w:hAnsi="Arial"/>
@@ -1521,148 +593,996 @@
                 <w:sz w:val="20"/>
                 <w:szCs w:val="20"/>
               </w:rPr>
-              <w:t xml:space="preserve">📸 Salida (o error) de los cuatro comandos para el bucket de imágenes</w:t>
-            </w:r>
-          </w:p>
-        </w:tc>
-      </w:tr>
-      <w:tr>
-        <w:trPr>
-          <w:trHeight w:val="2400"/>
-        </w:trPr>
-        <w:tc>
-          <w:tcPr>
-            <w:tcW w:type="dxa" w:w="9638"/>
-            <w:tcBorders>
-              <w:top w:val="single" w:color="E0E0E0" w:sz="4"/>
-              <w:left w:val="single" w:color="E0E0E0" w:sz="4"/>
-              <w:bottom w:val="single" w:color="E0E0E0" w:sz="4"/>
-              <w:right w:val="single" w:color="E0E0E0" w:sz="4"/>
-            </w:tcBorders>
-            <w:shd w:fill="FAFAFA" w:val="clear"/>
-            <w:tcMar>
-              <w:top w:type="dxa" w:w="80"/>
-              <w:left w:type="dxa" w:w="160"/>
-              <w:bottom w:type="dxa" w:w="80"/>
-              <w:right w:type="dxa" w:w="160"/>
-            </w:tcMar>
-          </w:tcPr>
-          <w:p>
-            <w:pPr>
-              <w:jc w:val="center"/>
-            </w:pPr>
-            <w:r>
-              <w:rPr>
-                <w:rFonts w:ascii="Arial" w:cs="Arial" w:eastAsia="Arial" w:hAnsi="Arial"/>
-                <w:i/>
-                <w:iCs/>
-                <w:color w:val="757575"/>
-                <w:sz w:val="20"/>
-                <w:szCs w:val="20"/>
-              </w:rPr>
-              <w:t xml:space="preserve">[Pega aquí la captura de pantalla]</w:t>
+              <w:t xml:space="preserve">Esfuerzo</w:t>
+            </w:r>
+          </w:p>
+        </w:tc>
+      </w:tr>
+      <w:tr>
+        <w:trPr>
+          <w:trHeight w:val="800"/>
+        </w:trPr>
+        <w:tc>
+          <w:tcPr>
+            <w:tcW w:type="dxa" w:w="1349"/>
+            <w:tcBorders>
+              <w:top w:val="single" w:color="E0E0E0" w:sz="4"/>
+              <w:left w:val="single" w:color="E0E0E0" w:sz="4"/>
+              <w:bottom w:val="single" w:color="E0E0E0" w:sz="4"/>
+              <w:right w:val="single" w:color="E0E0E0" w:sz="4"/>
+            </w:tcBorders>
+            <w:shd w:fill="FFFFFF" w:val="clear"/>
+            <w:tcMar>
+              <w:top w:type="dxa" w:w="80"/>
+              <w:left w:type="dxa" w:w="140"/>
+              <w:bottom w:type="dxa" w:w="80"/>
+              <w:right w:type="dxa" w:w="100"/>
+            </w:tcMar>
+          </w:tcPr>
+          <w:p>
+            <w:r>
+              <w:rPr>
+                <w:sz w:val="22"/>
+                <w:szCs w:val="22"/>
+              </w:rPr>
+              <w:t xml:space="preserve"/>
+            </w:r>
+          </w:p>
+        </w:tc>
+        <w:tc>
+          <w:tcPr>
+            <w:tcW w:type="dxa" w:w="3277"/>
+            <w:tcBorders>
+              <w:top w:val="single" w:color="E0E0E0" w:sz="4"/>
+              <w:left w:val="single" w:color="E0E0E0" w:sz="4"/>
+              <w:bottom w:val="single" w:color="E0E0E0" w:sz="4"/>
+              <w:right w:val="single" w:color="E0E0E0" w:sz="4"/>
+            </w:tcBorders>
+            <w:shd w:fill="FFFFFF" w:val="clear"/>
+            <w:tcMar>
+              <w:top w:type="dxa" w:w="80"/>
+              <w:left w:type="dxa" w:w="140"/>
+              <w:bottom w:type="dxa" w:w="80"/>
+              <w:right w:type="dxa" w:w="100"/>
+            </w:tcMar>
+          </w:tcPr>
+          <w:p>
+            <w:r>
+              <w:rPr>
+                <w:sz w:val="22"/>
+                <w:szCs w:val="22"/>
+              </w:rPr>
+              <w:t xml:space="preserve"/>
+            </w:r>
+          </w:p>
+        </w:tc>
+        <w:tc>
+          <w:tcPr>
+            <w:tcW w:type="dxa" w:w="1928"/>
+            <w:tcBorders>
+              <w:top w:val="single" w:color="E0E0E0" w:sz="4"/>
+              <w:left w:val="single" w:color="E0E0E0" w:sz="4"/>
+              <w:bottom w:val="single" w:color="E0E0E0" w:sz="4"/>
+              <w:right w:val="single" w:color="E0E0E0" w:sz="4"/>
+            </w:tcBorders>
+            <w:shd w:fill="FFFFFF" w:val="clear"/>
+            <w:tcMar>
+              <w:top w:type="dxa" w:w="80"/>
+              <w:left w:type="dxa" w:w="140"/>
+              <w:bottom w:type="dxa" w:w="80"/>
+              <w:right w:type="dxa" w:w="100"/>
+            </w:tcMar>
+          </w:tcPr>
+          <w:p>
+            <w:r>
+              <w:rPr>
+                <w:sz w:val="22"/>
+                <w:szCs w:val="22"/>
+              </w:rPr>
+              <w:t xml:space="preserve"/>
+            </w:r>
+          </w:p>
+        </w:tc>
+        <w:tc>
+          <w:tcPr>
+            <w:tcW w:type="dxa" w:w="1349"/>
+            <w:tcBorders>
+              <w:top w:val="single" w:color="E0E0E0" w:sz="4"/>
+              <w:left w:val="single" w:color="E0E0E0" w:sz="4"/>
+              <w:bottom w:val="single" w:color="E0E0E0" w:sz="4"/>
+              <w:right w:val="single" w:color="E0E0E0" w:sz="4"/>
+            </w:tcBorders>
+            <w:shd w:fill="FFFFFF" w:val="clear"/>
+            <w:tcMar>
+              <w:top w:type="dxa" w:w="80"/>
+              <w:left w:type="dxa" w:w="140"/>
+              <w:bottom w:type="dxa" w:w="80"/>
+              <w:right w:type="dxa" w:w="100"/>
+            </w:tcMar>
+          </w:tcPr>
+          <w:p>
+            <w:r>
+              <w:rPr>
+                <w:sz w:val="22"/>
+                <w:szCs w:val="22"/>
+              </w:rPr>
+              <w:t xml:space="preserve"/>
+            </w:r>
+          </w:p>
+        </w:tc>
+        <w:tc>
+          <w:tcPr>
+            <w:tcW w:type="dxa" w:w="1735"/>
+            <w:tcBorders>
+              <w:top w:val="single" w:color="E0E0E0" w:sz="4"/>
+              <w:left w:val="single" w:color="E0E0E0" w:sz="4"/>
+              <w:bottom w:val="single" w:color="E0E0E0" w:sz="4"/>
+              <w:right w:val="single" w:color="E0E0E0" w:sz="4"/>
+            </w:tcBorders>
+            <w:shd w:fill="FFFFFF" w:val="clear"/>
+            <w:tcMar>
+              <w:top w:type="dxa" w:w="80"/>
+              <w:left w:type="dxa" w:w="140"/>
+              <w:bottom w:type="dxa" w:w="80"/>
+              <w:right w:type="dxa" w:w="100"/>
+            </w:tcMar>
+          </w:tcPr>
+          <w:p>
+            <w:r>
+              <w:rPr>
+                <w:sz w:val="22"/>
+                <w:szCs w:val="22"/>
+              </w:rPr>
+              <w:t xml:space="preserve"/>
+            </w:r>
+          </w:p>
+        </w:tc>
+      </w:tr>
+      <w:tr>
+        <w:trPr>
+          <w:trHeight w:val="800"/>
+        </w:trPr>
+        <w:tc>
+          <w:tcPr>
+            <w:tcW w:type="dxa" w:w="1349"/>
+            <w:tcBorders>
+              <w:top w:val="single" w:color="E0E0E0" w:sz="4"/>
+              <w:left w:val="single" w:color="E0E0E0" w:sz="4"/>
+              <w:bottom w:val="single" w:color="E0E0E0" w:sz="4"/>
+              <w:right w:val="single" w:color="E0E0E0" w:sz="4"/>
+            </w:tcBorders>
+            <w:shd w:fill="F5F5F5" w:val="clear"/>
+            <w:tcMar>
+              <w:top w:type="dxa" w:w="80"/>
+              <w:left w:type="dxa" w:w="140"/>
+              <w:bottom w:type="dxa" w:w="80"/>
+              <w:right w:type="dxa" w:w="100"/>
+            </w:tcMar>
+          </w:tcPr>
+          <w:p>
+            <w:r>
+              <w:rPr>
+                <w:sz w:val="22"/>
+                <w:szCs w:val="22"/>
+              </w:rPr>
+              <w:t xml:space="preserve"/>
+            </w:r>
+          </w:p>
+        </w:tc>
+        <w:tc>
+          <w:tcPr>
+            <w:tcW w:type="dxa" w:w="3277"/>
+            <w:tcBorders>
+              <w:top w:val="single" w:color="E0E0E0" w:sz="4"/>
+              <w:left w:val="single" w:color="E0E0E0" w:sz="4"/>
+              <w:bottom w:val="single" w:color="E0E0E0" w:sz="4"/>
+              <w:right w:val="single" w:color="E0E0E0" w:sz="4"/>
+            </w:tcBorders>
+            <w:shd w:fill="F5F5F5" w:val="clear"/>
+            <w:tcMar>
+              <w:top w:type="dxa" w:w="80"/>
+              <w:left w:type="dxa" w:w="140"/>
+              <w:bottom w:type="dxa" w:w="80"/>
+              <w:right w:type="dxa" w:w="100"/>
+            </w:tcMar>
+          </w:tcPr>
+          <w:p>
+            <w:r>
+              <w:rPr>
+                <w:sz w:val="22"/>
+                <w:szCs w:val="22"/>
+              </w:rPr>
+              <w:t xml:space="preserve"/>
+            </w:r>
+          </w:p>
+        </w:tc>
+        <w:tc>
+          <w:tcPr>
+            <w:tcW w:type="dxa" w:w="1928"/>
+            <w:tcBorders>
+              <w:top w:val="single" w:color="E0E0E0" w:sz="4"/>
+              <w:left w:val="single" w:color="E0E0E0" w:sz="4"/>
+              <w:bottom w:val="single" w:color="E0E0E0" w:sz="4"/>
+              <w:right w:val="single" w:color="E0E0E0" w:sz="4"/>
+            </w:tcBorders>
+            <w:shd w:fill="F5F5F5" w:val="clear"/>
+            <w:tcMar>
+              <w:top w:type="dxa" w:w="80"/>
+              <w:left w:type="dxa" w:w="140"/>
+              <w:bottom w:type="dxa" w:w="80"/>
+              <w:right w:type="dxa" w:w="100"/>
+            </w:tcMar>
+          </w:tcPr>
+          <w:p>
+            <w:r>
+              <w:rPr>
+                <w:sz w:val="22"/>
+                <w:szCs w:val="22"/>
+              </w:rPr>
+              <w:t xml:space="preserve"/>
+            </w:r>
+          </w:p>
+        </w:tc>
+        <w:tc>
+          <w:tcPr>
+            <w:tcW w:type="dxa" w:w="1349"/>
+            <w:tcBorders>
+              <w:top w:val="single" w:color="E0E0E0" w:sz="4"/>
+              <w:left w:val="single" w:color="E0E0E0" w:sz="4"/>
+              <w:bottom w:val="single" w:color="E0E0E0" w:sz="4"/>
+              <w:right w:val="single" w:color="E0E0E0" w:sz="4"/>
+            </w:tcBorders>
+            <w:shd w:fill="F5F5F5" w:val="clear"/>
+            <w:tcMar>
+              <w:top w:type="dxa" w:w="80"/>
+              <w:left w:type="dxa" w:w="140"/>
+              <w:bottom w:type="dxa" w:w="80"/>
+              <w:right w:type="dxa" w:w="100"/>
+            </w:tcMar>
+          </w:tcPr>
+          <w:p>
+            <w:r>
+              <w:rPr>
+                <w:sz w:val="22"/>
+                <w:szCs w:val="22"/>
+              </w:rPr>
+              <w:t xml:space="preserve"/>
+            </w:r>
+          </w:p>
+        </w:tc>
+        <w:tc>
+          <w:tcPr>
+            <w:tcW w:type="dxa" w:w="1735"/>
+            <w:tcBorders>
+              <w:top w:val="single" w:color="E0E0E0" w:sz="4"/>
+              <w:left w:val="single" w:color="E0E0E0" w:sz="4"/>
+              <w:bottom w:val="single" w:color="E0E0E0" w:sz="4"/>
+              <w:right w:val="single" w:color="E0E0E0" w:sz="4"/>
+            </w:tcBorders>
+            <w:shd w:fill="F5F5F5" w:val="clear"/>
+            <w:tcMar>
+              <w:top w:type="dxa" w:w="80"/>
+              <w:left w:type="dxa" w:w="140"/>
+              <w:bottom w:type="dxa" w:w="80"/>
+              <w:right w:type="dxa" w:w="100"/>
+            </w:tcMar>
+          </w:tcPr>
+          <w:p>
+            <w:r>
+              <w:rPr>
+                <w:sz w:val="22"/>
+                <w:szCs w:val="22"/>
+              </w:rPr>
+              <w:t xml:space="preserve"/>
+            </w:r>
+          </w:p>
+        </w:tc>
+      </w:tr>
+      <w:tr>
+        <w:trPr>
+          <w:trHeight w:val="800"/>
+        </w:trPr>
+        <w:tc>
+          <w:tcPr>
+            <w:tcW w:type="dxa" w:w="1349"/>
+            <w:tcBorders>
+              <w:top w:val="single" w:color="E0E0E0" w:sz="4"/>
+              <w:left w:val="single" w:color="E0E0E0" w:sz="4"/>
+              <w:bottom w:val="single" w:color="E0E0E0" w:sz="4"/>
+              <w:right w:val="single" w:color="E0E0E0" w:sz="4"/>
+            </w:tcBorders>
+            <w:shd w:fill="FFFFFF" w:val="clear"/>
+            <w:tcMar>
+              <w:top w:type="dxa" w:w="80"/>
+              <w:left w:type="dxa" w:w="140"/>
+              <w:bottom w:type="dxa" w:w="80"/>
+              <w:right w:type="dxa" w:w="100"/>
+            </w:tcMar>
+          </w:tcPr>
+          <w:p>
+            <w:r>
+              <w:rPr>
+                <w:sz w:val="22"/>
+                <w:szCs w:val="22"/>
+              </w:rPr>
+              <w:t xml:space="preserve"/>
+            </w:r>
+          </w:p>
+        </w:tc>
+        <w:tc>
+          <w:tcPr>
+            <w:tcW w:type="dxa" w:w="3277"/>
+            <w:tcBorders>
+              <w:top w:val="single" w:color="E0E0E0" w:sz="4"/>
+              <w:left w:val="single" w:color="E0E0E0" w:sz="4"/>
+              <w:bottom w:val="single" w:color="E0E0E0" w:sz="4"/>
+              <w:right w:val="single" w:color="E0E0E0" w:sz="4"/>
+            </w:tcBorders>
+            <w:shd w:fill="FFFFFF" w:val="clear"/>
+            <w:tcMar>
+              <w:top w:type="dxa" w:w="80"/>
+              <w:left w:type="dxa" w:w="140"/>
+              <w:bottom w:type="dxa" w:w="80"/>
+              <w:right w:type="dxa" w:w="100"/>
+            </w:tcMar>
+          </w:tcPr>
+          <w:p>
+            <w:r>
+              <w:rPr>
+                <w:sz w:val="22"/>
+                <w:szCs w:val="22"/>
+              </w:rPr>
+              <w:t xml:space="preserve"/>
+            </w:r>
+          </w:p>
+        </w:tc>
+        <w:tc>
+          <w:tcPr>
+            <w:tcW w:type="dxa" w:w="1928"/>
+            <w:tcBorders>
+              <w:top w:val="single" w:color="E0E0E0" w:sz="4"/>
+              <w:left w:val="single" w:color="E0E0E0" w:sz="4"/>
+              <w:bottom w:val="single" w:color="E0E0E0" w:sz="4"/>
+              <w:right w:val="single" w:color="E0E0E0" w:sz="4"/>
+            </w:tcBorders>
+            <w:shd w:fill="FFFFFF" w:val="clear"/>
+            <w:tcMar>
+              <w:top w:type="dxa" w:w="80"/>
+              <w:left w:type="dxa" w:w="140"/>
+              <w:bottom w:type="dxa" w:w="80"/>
+              <w:right w:type="dxa" w:w="100"/>
+            </w:tcMar>
+          </w:tcPr>
+          <w:p>
+            <w:r>
+              <w:rPr>
+                <w:sz w:val="22"/>
+                <w:szCs w:val="22"/>
+              </w:rPr>
+              <w:t xml:space="preserve"/>
+            </w:r>
+          </w:p>
+        </w:tc>
+        <w:tc>
+          <w:tcPr>
+            <w:tcW w:type="dxa" w:w="1349"/>
+            <w:tcBorders>
+              <w:top w:val="single" w:color="E0E0E0" w:sz="4"/>
+              <w:left w:val="single" w:color="E0E0E0" w:sz="4"/>
+              <w:bottom w:val="single" w:color="E0E0E0" w:sz="4"/>
+              <w:right w:val="single" w:color="E0E0E0" w:sz="4"/>
+            </w:tcBorders>
+            <w:shd w:fill="FFFFFF" w:val="clear"/>
+            <w:tcMar>
+              <w:top w:type="dxa" w:w="80"/>
+              <w:left w:type="dxa" w:w="140"/>
+              <w:bottom w:type="dxa" w:w="80"/>
+              <w:right w:type="dxa" w:w="100"/>
+            </w:tcMar>
+          </w:tcPr>
+          <w:p>
+            <w:r>
+              <w:rPr>
+                <w:sz w:val="22"/>
+                <w:szCs w:val="22"/>
+              </w:rPr>
+              <w:t xml:space="preserve"/>
+            </w:r>
+          </w:p>
+        </w:tc>
+        <w:tc>
+          <w:tcPr>
+            <w:tcW w:type="dxa" w:w="1735"/>
+            <w:tcBorders>
+              <w:top w:val="single" w:color="E0E0E0" w:sz="4"/>
+              <w:left w:val="single" w:color="E0E0E0" w:sz="4"/>
+              <w:bottom w:val="single" w:color="E0E0E0" w:sz="4"/>
+              <w:right w:val="single" w:color="E0E0E0" w:sz="4"/>
+            </w:tcBorders>
+            <w:shd w:fill="FFFFFF" w:val="clear"/>
+            <w:tcMar>
+              <w:top w:type="dxa" w:w="80"/>
+              <w:left w:type="dxa" w:w="140"/>
+              <w:bottom w:type="dxa" w:w="80"/>
+              <w:right w:type="dxa" w:w="100"/>
+            </w:tcMar>
+          </w:tcPr>
+          <w:p>
+            <w:r>
+              <w:rPr>
+                <w:sz w:val="22"/>
+                <w:szCs w:val="22"/>
+              </w:rPr>
+              <w:t xml:space="preserve"/>
+            </w:r>
+          </w:p>
+        </w:tc>
+      </w:tr>
+      <w:tr>
+        <w:trPr>
+          <w:trHeight w:val="800"/>
+        </w:trPr>
+        <w:tc>
+          <w:tcPr>
+            <w:tcW w:type="dxa" w:w="1349"/>
+            <w:tcBorders>
+              <w:top w:val="single" w:color="E0E0E0" w:sz="4"/>
+              <w:left w:val="single" w:color="E0E0E0" w:sz="4"/>
+              <w:bottom w:val="single" w:color="E0E0E0" w:sz="4"/>
+              <w:right w:val="single" w:color="E0E0E0" w:sz="4"/>
+            </w:tcBorders>
+            <w:shd w:fill="F5F5F5" w:val="clear"/>
+            <w:tcMar>
+              <w:top w:type="dxa" w:w="80"/>
+              <w:left w:type="dxa" w:w="140"/>
+              <w:bottom w:type="dxa" w:w="80"/>
+              <w:right w:type="dxa" w:w="100"/>
+            </w:tcMar>
+          </w:tcPr>
+          <w:p>
+            <w:r>
+              <w:rPr>
+                <w:sz w:val="22"/>
+                <w:szCs w:val="22"/>
+              </w:rPr>
+              <w:t xml:space="preserve"/>
+            </w:r>
+          </w:p>
+        </w:tc>
+        <w:tc>
+          <w:tcPr>
+            <w:tcW w:type="dxa" w:w="3277"/>
+            <w:tcBorders>
+              <w:top w:val="single" w:color="E0E0E0" w:sz="4"/>
+              <w:left w:val="single" w:color="E0E0E0" w:sz="4"/>
+              <w:bottom w:val="single" w:color="E0E0E0" w:sz="4"/>
+              <w:right w:val="single" w:color="E0E0E0" w:sz="4"/>
+            </w:tcBorders>
+            <w:shd w:fill="F5F5F5" w:val="clear"/>
+            <w:tcMar>
+              <w:top w:type="dxa" w:w="80"/>
+              <w:left w:type="dxa" w:w="140"/>
+              <w:bottom w:type="dxa" w:w="80"/>
+              <w:right w:type="dxa" w:w="100"/>
+            </w:tcMar>
+          </w:tcPr>
+          <w:p>
+            <w:r>
+              <w:rPr>
+                <w:sz w:val="22"/>
+                <w:szCs w:val="22"/>
+              </w:rPr>
+              <w:t xml:space="preserve"/>
+            </w:r>
+          </w:p>
+        </w:tc>
+        <w:tc>
+          <w:tcPr>
+            <w:tcW w:type="dxa" w:w="1928"/>
+            <w:tcBorders>
+              <w:top w:val="single" w:color="E0E0E0" w:sz="4"/>
+              <w:left w:val="single" w:color="E0E0E0" w:sz="4"/>
+              <w:bottom w:val="single" w:color="E0E0E0" w:sz="4"/>
+              <w:right w:val="single" w:color="E0E0E0" w:sz="4"/>
+            </w:tcBorders>
+            <w:shd w:fill="F5F5F5" w:val="clear"/>
+            <w:tcMar>
+              <w:top w:type="dxa" w:w="80"/>
+              <w:left w:type="dxa" w:w="140"/>
+              <w:bottom w:type="dxa" w:w="80"/>
+              <w:right w:type="dxa" w:w="100"/>
+            </w:tcMar>
+          </w:tcPr>
+          <w:p>
+            <w:r>
+              <w:rPr>
+                <w:sz w:val="22"/>
+                <w:szCs w:val="22"/>
+              </w:rPr>
+              <w:t xml:space="preserve"/>
+            </w:r>
+          </w:p>
+        </w:tc>
+        <w:tc>
+          <w:tcPr>
+            <w:tcW w:type="dxa" w:w="1349"/>
+            <w:tcBorders>
+              <w:top w:val="single" w:color="E0E0E0" w:sz="4"/>
+              <w:left w:val="single" w:color="E0E0E0" w:sz="4"/>
+              <w:bottom w:val="single" w:color="E0E0E0" w:sz="4"/>
+              <w:right w:val="single" w:color="E0E0E0" w:sz="4"/>
+            </w:tcBorders>
+            <w:shd w:fill="F5F5F5" w:val="clear"/>
+            <w:tcMar>
+              <w:top w:type="dxa" w:w="80"/>
+              <w:left w:type="dxa" w:w="140"/>
+              <w:bottom w:type="dxa" w:w="80"/>
+              <w:right w:type="dxa" w:w="100"/>
+            </w:tcMar>
+          </w:tcPr>
+          <w:p>
+            <w:r>
+              <w:rPr>
+                <w:sz w:val="22"/>
+                <w:szCs w:val="22"/>
+              </w:rPr>
+              <w:t xml:space="preserve"/>
+            </w:r>
+          </w:p>
+        </w:tc>
+        <w:tc>
+          <w:tcPr>
+            <w:tcW w:type="dxa" w:w="1735"/>
+            <w:tcBorders>
+              <w:top w:val="single" w:color="E0E0E0" w:sz="4"/>
+              <w:left w:val="single" w:color="E0E0E0" w:sz="4"/>
+              <w:bottom w:val="single" w:color="E0E0E0" w:sz="4"/>
+              <w:right w:val="single" w:color="E0E0E0" w:sz="4"/>
+            </w:tcBorders>
+            <w:shd w:fill="F5F5F5" w:val="clear"/>
+            <w:tcMar>
+              <w:top w:type="dxa" w:w="80"/>
+              <w:left w:type="dxa" w:w="140"/>
+              <w:bottom w:type="dxa" w:w="80"/>
+              <w:right w:type="dxa" w:w="100"/>
+            </w:tcMar>
+          </w:tcPr>
+          <w:p>
+            <w:r>
+              <w:rPr>
+                <w:sz w:val="22"/>
+                <w:szCs w:val="22"/>
+              </w:rPr>
+              <w:t xml:space="preserve"/>
+            </w:r>
+          </w:p>
+        </w:tc>
+      </w:tr>
+      <w:tr>
+        <w:trPr>
+          <w:trHeight w:val="800"/>
+        </w:trPr>
+        <w:tc>
+          <w:tcPr>
+            <w:tcW w:type="dxa" w:w="1349"/>
+            <w:tcBorders>
+              <w:top w:val="single" w:color="E0E0E0" w:sz="4"/>
+              <w:left w:val="single" w:color="E0E0E0" w:sz="4"/>
+              <w:bottom w:val="single" w:color="E0E0E0" w:sz="4"/>
+              <w:right w:val="single" w:color="E0E0E0" w:sz="4"/>
+            </w:tcBorders>
+            <w:shd w:fill="FFFFFF" w:val="clear"/>
+            <w:tcMar>
+              <w:top w:type="dxa" w:w="80"/>
+              <w:left w:type="dxa" w:w="140"/>
+              <w:bottom w:type="dxa" w:w="80"/>
+              <w:right w:type="dxa" w:w="100"/>
+            </w:tcMar>
+          </w:tcPr>
+          <w:p>
+            <w:r>
+              <w:rPr>
+                <w:sz w:val="22"/>
+                <w:szCs w:val="22"/>
+              </w:rPr>
+              <w:t xml:space="preserve"/>
+            </w:r>
+          </w:p>
+        </w:tc>
+        <w:tc>
+          <w:tcPr>
+            <w:tcW w:type="dxa" w:w="3277"/>
+            <w:tcBorders>
+              <w:top w:val="single" w:color="E0E0E0" w:sz="4"/>
+              <w:left w:val="single" w:color="E0E0E0" w:sz="4"/>
+              <w:bottom w:val="single" w:color="E0E0E0" w:sz="4"/>
+              <w:right w:val="single" w:color="E0E0E0" w:sz="4"/>
+            </w:tcBorders>
+            <w:shd w:fill="FFFFFF" w:val="clear"/>
+            <w:tcMar>
+              <w:top w:type="dxa" w:w="80"/>
+              <w:left w:type="dxa" w:w="140"/>
+              <w:bottom w:type="dxa" w:w="80"/>
+              <w:right w:type="dxa" w:w="100"/>
+            </w:tcMar>
+          </w:tcPr>
+          <w:p>
+            <w:r>
+              <w:rPr>
+                <w:sz w:val="22"/>
+                <w:szCs w:val="22"/>
+              </w:rPr>
+              <w:t xml:space="preserve"/>
+            </w:r>
+          </w:p>
+        </w:tc>
+        <w:tc>
+          <w:tcPr>
+            <w:tcW w:type="dxa" w:w="1928"/>
+            <w:tcBorders>
+              <w:top w:val="single" w:color="E0E0E0" w:sz="4"/>
+              <w:left w:val="single" w:color="E0E0E0" w:sz="4"/>
+              <w:bottom w:val="single" w:color="E0E0E0" w:sz="4"/>
+              <w:right w:val="single" w:color="E0E0E0" w:sz="4"/>
+            </w:tcBorders>
+            <w:shd w:fill="FFFFFF" w:val="clear"/>
+            <w:tcMar>
+              <w:top w:type="dxa" w:w="80"/>
+              <w:left w:type="dxa" w:w="140"/>
+              <w:bottom w:type="dxa" w:w="80"/>
+              <w:right w:type="dxa" w:w="100"/>
+            </w:tcMar>
+          </w:tcPr>
+          <w:p>
+            <w:r>
+              <w:rPr>
+                <w:sz w:val="22"/>
+                <w:szCs w:val="22"/>
+              </w:rPr>
+              <w:t xml:space="preserve"/>
+            </w:r>
+          </w:p>
+        </w:tc>
+        <w:tc>
+          <w:tcPr>
+            <w:tcW w:type="dxa" w:w="1349"/>
+            <w:tcBorders>
+              <w:top w:val="single" w:color="E0E0E0" w:sz="4"/>
+              <w:left w:val="single" w:color="E0E0E0" w:sz="4"/>
+              <w:bottom w:val="single" w:color="E0E0E0" w:sz="4"/>
+              <w:right w:val="single" w:color="E0E0E0" w:sz="4"/>
+            </w:tcBorders>
+            <w:shd w:fill="FFFFFF" w:val="clear"/>
+            <w:tcMar>
+              <w:top w:type="dxa" w:w="80"/>
+              <w:left w:type="dxa" w:w="140"/>
+              <w:bottom w:type="dxa" w:w="80"/>
+              <w:right w:type="dxa" w:w="100"/>
+            </w:tcMar>
+          </w:tcPr>
+          <w:p>
+            <w:r>
+              <w:rPr>
+                <w:sz w:val="22"/>
+                <w:szCs w:val="22"/>
+              </w:rPr>
+              <w:t xml:space="preserve"/>
+            </w:r>
+          </w:p>
+        </w:tc>
+        <w:tc>
+          <w:tcPr>
+            <w:tcW w:type="dxa" w:w="1735"/>
+            <w:tcBorders>
+              <w:top w:val="single" w:color="E0E0E0" w:sz="4"/>
+              <w:left w:val="single" w:color="E0E0E0" w:sz="4"/>
+              <w:bottom w:val="single" w:color="E0E0E0" w:sz="4"/>
+              <w:right w:val="single" w:color="E0E0E0" w:sz="4"/>
+            </w:tcBorders>
+            <w:shd w:fill="FFFFFF" w:val="clear"/>
+            <w:tcMar>
+              <w:top w:type="dxa" w:w="80"/>
+              <w:left w:type="dxa" w:w="140"/>
+              <w:bottom w:type="dxa" w:w="80"/>
+              <w:right w:type="dxa" w:w="100"/>
+            </w:tcMar>
+          </w:tcPr>
+          <w:p>
+            <w:r>
+              <w:rPr>
+                <w:sz w:val="22"/>
+                <w:szCs w:val="22"/>
+              </w:rPr>
+              <w:t xml:space="preserve"/>
+            </w:r>
+          </w:p>
+        </w:tc>
+      </w:tr>
+      <w:tr>
+        <w:trPr>
+          <w:trHeight w:val="800"/>
+        </w:trPr>
+        <w:tc>
+          <w:tcPr>
+            <w:tcW w:type="dxa" w:w="1349"/>
+            <w:tcBorders>
+              <w:top w:val="single" w:color="E0E0E0" w:sz="4"/>
+              <w:left w:val="single" w:color="E0E0E0" w:sz="4"/>
+              <w:bottom w:val="single" w:color="E0E0E0" w:sz="4"/>
+              <w:right w:val="single" w:color="E0E0E0" w:sz="4"/>
+            </w:tcBorders>
+            <w:shd w:fill="F5F5F5" w:val="clear"/>
+            <w:tcMar>
+              <w:top w:type="dxa" w:w="80"/>
+              <w:left w:type="dxa" w:w="140"/>
+              <w:bottom w:type="dxa" w:w="80"/>
+              <w:right w:type="dxa" w:w="100"/>
+            </w:tcMar>
+          </w:tcPr>
+          <w:p>
+            <w:r>
+              <w:rPr>
+                <w:sz w:val="22"/>
+                <w:szCs w:val="22"/>
+              </w:rPr>
+              <w:t xml:space="preserve"/>
+            </w:r>
+          </w:p>
+        </w:tc>
+        <w:tc>
+          <w:tcPr>
+            <w:tcW w:type="dxa" w:w="3277"/>
+            <w:tcBorders>
+              <w:top w:val="single" w:color="E0E0E0" w:sz="4"/>
+              <w:left w:val="single" w:color="E0E0E0" w:sz="4"/>
+              <w:bottom w:val="single" w:color="E0E0E0" w:sz="4"/>
+              <w:right w:val="single" w:color="E0E0E0" w:sz="4"/>
+            </w:tcBorders>
+            <w:shd w:fill="F5F5F5" w:val="clear"/>
+            <w:tcMar>
+              <w:top w:type="dxa" w:w="80"/>
+              <w:left w:type="dxa" w:w="140"/>
+              <w:bottom w:type="dxa" w:w="80"/>
+              <w:right w:type="dxa" w:w="100"/>
+            </w:tcMar>
+          </w:tcPr>
+          <w:p>
+            <w:r>
+              <w:rPr>
+                <w:sz w:val="22"/>
+                <w:szCs w:val="22"/>
+              </w:rPr>
+              <w:t xml:space="preserve"/>
+            </w:r>
+          </w:p>
+        </w:tc>
+        <w:tc>
+          <w:tcPr>
+            <w:tcW w:type="dxa" w:w="1928"/>
+            <w:tcBorders>
+              <w:top w:val="single" w:color="E0E0E0" w:sz="4"/>
+              <w:left w:val="single" w:color="E0E0E0" w:sz="4"/>
+              <w:bottom w:val="single" w:color="E0E0E0" w:sz="4"/>
+              <w:right w:val="single" w:color="E0E0E0" w:sz="4"/>
+            </w:tcBorders>
+            <w:shd w:fill="F5F5F5" w:val="clear"/>
+            <w:tcMar>
+              <w:top w:type="dxa" w:w="80"/>
+              <w:left w:type="dxa" w:w="140"/>
+              <w:bottom w:type="dxa" w:w="80"/>
+              <w:right w:type="dxa" w:w="100"/>
+            </w:tcMar>
+          </w:tcPr>
+          <w:p>
+            <w:r>
+              <w:rPr>
+                <w:sz w:val="22"/>
+                <w:szCs w:val="22"/>
+              </w:rPr>
+              <w:t xml:space="preserve"/>
+            </w:r>
+          </w:p>
+        </w:tc>
+        <w:tc>
+          <w:tcPr>
+            <w:tcW w:type="dxa" w:w="1349"/>
+            <w:tcBorders>
+              <w:top w:val="single" w:color="E0E0E0" w:sz="4"/>
+              <w:left w:val="single" w:color="E0E0E0" w:sz="4"/>
+              <w:bottom w:val="single" w:color="E0E0E0" w:sz="4"/>
+              <w:right w:val="single" w:color="E0E0E0" w:sz="4"/>
+            </w:tcBorders>
+            <w:shd w:fill="F5F5F5" w:val="clear"/>
+            <w:tcMar>
+              <w:top w:type="dxa" w:w="80"/>
+              <w:left w:type="dxa" w:w="140"/>
+              <w:bottom w:type="dxa" w:w="80"/>
+              <w:right w:type="dxa" w:w="100"/>
+            </w:tcMar>
+          </w:tcPr>
+          <w:p>
+            <w:r>
+              <w:rPr>
+                <w:sz w:val="22"/>
+                <w:szCs w:val="22"/>
+              </w:rPr>
+              <w:t xml:space="preserve"/>
+            </w:r>
+          </w:p>
+        </w:tc>
+        <w:tc>
+          <w:tcPr>
+            <w:tcW w:type="dxa" w:w="1735"/>
+            <w:tcBorders>
+              <w:top w:val="single" w:color="E0E0E0" w:sz="4"/>
+              <w:left w:val="single" w:color="E0E0E0" w:sz="4"/>
+              <w:bottom w:val="single" w:color="E0E0E0" w:sz="4"/>
+              <w:right w:val="single" w:color="E0E0E0" w:sz="4"/>
+            </w:tcBorders>
+            <w:shd w:fill="F5F5F5" w:val="clear"/>
+            <w:tcMar>
+              <w:top w:type="dxa" w:w="80"/>
+              <w:left w:type="dxa" w:w="140"/>
+              <w:bottom w:type="dxa" w:w="80"/>
+              <w:right w:type="dxa" w:w="100"/>
+            </w:tcMar>
+          </w:tcPr>
+          <w:p>
+            <w:r>
+              <w:rPr>
+                <w:sz w:val="22"/>
+                <w:szCs w:val="22"/>
+              </w:rPr>
+              <w:t xml:space="preserve"/>
+            </w:r>
+          </w:p>
+        </w:tc>
+      </w:tr>
+      <w:tr>
+        <w:trPr>
+          <w:trHeight w:val="800"/>
+        </w:trPr>
+        <w:tc>
+          <w:tcPr>
+            <w:tcW w:type="dxa" w:w="1349"/>
+            <w:tcBorders>
+              <w:top w:val="single" w:color="E0E0E0" w:sz="4"/>
+              <w:left w:val="single" w:color="E0E0E0" w:sz="4"/>
+              <w:bottom w:val="single" w:color="E0E0E0" w:sz="4"/>
+              <w:right w:val="single" w:color="E0E0E0" w:sz="4"/>
+            </w:tcBorders>
+            <w:shd w:fill="FFFFFF" w:val="clear"/>
+            <w:tcMar>
+              <w:top w:type="dxa" w:w="80"/>
+              <w:left w:type="dxa" w:w="140"/>
+              <w:bottom w:type="dxa" w:w="80"/>
+              <w:right w:type="dxa" w:w="100"/>
+            </w:tcMar>
+          </w:tcPr>
+          <w:p>
+            <w:r>
+              <w:rPr>
+                <w:sz w:val="22"/>
+                <w:szCs w:val="22"/>
+              </w:rPr>
+              <w:t xml:space="preserve"/>
+            </w:r>
+          </w:p>
+        </w:tc>
+        <w:tc>
+          <w:tcPr>
+            <w:tcW w:type="dxa" w:w="3277"/>
+            <w:tcBorders>
+              <w:top w:val="single" w:color="E0E0E0" w:sz="4"/>
+              <w:left w:val="single" w:color="E0E0E0" w:sz="4"/>
+              <w:bottom w:val="single" w:color="E0E0E0" w:sz="4"/>
+              <w:right w:val="single" w:color="E0E0E0" w:sz="4"/>
+            </w:tcBorders>
+            <w:shd w:fill="FFFFFF" w:val="clear"/>
+            <w:tcMar>
+              <w:top w:type="dxa" w:w="80"/>
+              <w:left w:type="dxa" w:w="140"/>
+              <w:bottom w:type="dxa" w:w="80"/>
+              <w:right w:type="dxa" w:w="100"/>
+            </w:tcMar>
+          </w:tcPr>
+          <w:p>
+            <w:r>
+              <w:rPr>
+                <w:sz w:val="22"/>
+                <w:szCs w:val="22"/>
+              </w:rPr>
+              <w:t xml:space="preserve"/>
+            </w:r>
+          </w:p>
+        </w:tc>
+        <w:tc>
+          <w:tcPr>
+            <w:tcW w:type="dxa" w:w="1928"/>
+            <w:tcBorders>
+              <w:top w:val="single" w:color="E0E0E0" w:sz="4"/>
+              <w:left w:val="single" w:color="E0E0E0" w:sz="4"/>
+              <w:bottom w:val="single" w:color="E0E0E0" w:sz="4"/>
+              <w:right w:val="single" w:color="E0E0E0" w:sz="4"/>
+            </w:tcBorders>
+            <w:shd w:fill="FFFFFF" w:val="clear"/>
+            <w:tcMar>
+              <w:top w:type="dxa" w:w="80"/>
+              <w:left w:type="dxa" w:w="140"/>
+              <w:bottom w:type="dxa" w:w="80"/>
+              <w:right w:type="dxa" w:w="100"/>
+            </w:tcMar>
+          </w:tcPr>
+          <w:p>
+            <w:r>
+              <w:rPr>
+                <w:sz w:val="22"/>
+                <w:szCs w:val="22"/>
+              </w:rPr>
+              <w:t xml:space="preserve"/>
+            </w:r>
+          </w:p>
+        </w:tc>
+        <w:tc>
+          <w:tcPr>
+            <w:tcW w:type="dxa" w:w="1349"/>
+            <w:tcBorders>
+              <w:top w:val="single" w:color="E0E0E0" w:sz="4"/>
+              <w:left w:val="single" w:color="E0E0E0" w:sz="4"/>
+              <w:bottom w:val="single" w:color="E0E0E0" w:sz="4"/>
+              <w:right w:val="single" w:color="E0E0E0" w:sz="4"/>
+            </w:tcBorders>
+            <w:shd w:fill="FFFFFF" w:val="clear"/>
+            <w:tcMar>
+              <w:top w:type="dxa" w:w="80"/>
+              <w:left w:type="dxa" w:w="140"/>
+              <w:bottom w:type="dxa" w:w="80"/>
+              <w:right w:type="dxa" w:w="100"/>
+            </w:tcMar>
+          </w:tcPr>
+          <w:p>
+            <w:r>
+              <w:rPr>
+                <w:sz w:val="22"/>
+                <w:szCs w:val="22"/>
+              </w:rPr>
+              <w:t xml:space="preserve"/>
+            </w:r>
+          </w:p>
+        </w:tc>
+        <w:tc>
+          <w:tcPr>
+            <w:tcW w:type="dxa" w:w="1735"/>
+            <w:tcBorders>
+              <w:top w:val="single" w:color="E0E0E0" w:sz="4"/>
+              <w:left w:val="single" w:color="E0E0E0" w:sz="4"/>
+              <w:bottom w:val="single" w:color="E0E0E0" w:sz="4"/>
+              <w:right w:val="single" w:color="E0E0E0" w:sz="4"/>
+            </w:tcBorders>
+            <w:shd w:fill="FFFFFF" w:val="clear"/>
+            <w:tcMar>
+              <w:top w:type="dxa" w:w="80"/>
+              <w:left w:type="dxa" w:w="140"/>
+              <w:bottom w:type="dxa" w:w="80"/>
+              <w:right w:type="dxa" w:w="100"/>
+            </w:tcMar>
+          </w:tcPr>
+          <w:p>
+            <w:r>
+              <w:rPr>
+                <w:sz w:val="22"/>
+                <w:szCs w:val="22"/>
+              </w:rPr>
+              <w:t xml:space="preserve"/>
             </w:r>
           </w:p>
         </w:tc>
       </w:tr>
     </w:tbl>
     <w:p>
-      <w:pPr>
-        <w:spacing w:after="120"/>
-      </w:pPr>
-    </w:p>
-    <w:tbl>
-      <w:tblPr>
-        <w:tblW w:type="dxa" w:w="9638"/>
-        <w:tblBorders>
-          <w:top w:val="single" w:color="auto" w:sz="4"/>
-          <w:left w:val="single" w:color="auto" w:sz="4"/>
-          <w:bottom w:val="single" w:color="auto" w:sz="4"/>
-          <w:right w:val="single" w:color="auto" w:sz="4"/>
-          <w:insideH w:val="single" w:color="auto" w:sz="4"/>
-          <w:insideV w:val="single" w:color="auto" w:sz="4"/>
-        </w:tblBorders>
-      </w:tblPr>
-      <w:tblGrid>
-        <w:gridCol w:w="9638"/>
-      </w:tblGrid>
-      <w:tr>
-        <w:tc>
-          <w:tcPr>
-            <w:tcW w:type="dxa" w:w="9638"/>
-            <w:tcBorders>
-              <w:top w:val="none" w:color="FFFFFF" w:sz="0"/>
-              <w:left w:val="none" w:color="FFFFFF" w:sz="0"/>
-              <w:bottom w:val="none" w:color="FFFFFF" w:sz="0"/>
-              <w:right w:val="none" w:color="FFFFFF" w:sz="0"/>
-            </w:tcBorders>
-            <w:shd w:fill="3949AB" w:val="clear"/>
-            <w:tcMar>
-              <w:top w:type="dxa" w:w="80"/>
-              <w:left w:type="dxa" w:w="160"/>
-              <w:bottom w:type="dxa" w:w="80"/>
-              <w:right w:type="dxa" w:w="160"/>
-            </w:tcMar>
-          </w:tcPr>
-          <w:p>
-            <w:r>
-              <w:rPr>
-                <w:rFonts w:ascii="Arial" w:cs="Arial" w:eastAsia="Arial" w:hAnsi="Arial"/>
-                <w:b/>
-                <w:bCs/>
-                <w:color w:val="FFFFFF"/>
-                <w:sz w:val="20"/>
-                <w:szCs w:val="20"/>
-              </w:rPr>
-              <w:t xml:space="preserve">📸 Salida (o error) de los cuatro comandos para el bucket del frontend</w:t>
-            </w:r>
-          </w:p>
-        </w:tc>
-      </w:tr>
-      <w:tr>
-        <w:trPr>
-          <w:trHeight w:val="2400"/>
-        </w:trPr>
-        <w:tc>
-          <w:tcPr>
-            <w:tcW w:type="dxa" w:w="9638"/>
-            <w:tcBorders>
-              <w:top w:val="single" w:color="E0E0E0" w:sz="4"/>
-              <w:left w:val="single" w:color="E0E0E0" w:sz="4"/>
-              <w:bottom w:val="single" w:color="E0E0E0" w:sz="4"/>
-              <w:right w:val="single" w:color="E0E0E0" w:sz="4"/>
-            </w:tcBorders>
-            <w:shd w:fill="FAFAFA" w:val="clear"/>
-            <w:tcMar>
-              <w:top w:type="dxa" w:w="80"/>
-              <w:left w:type="dxa" w:w="160"/>
-              <w:bottom w:type="dxa" w:w="80"/>
-              <w:right w:type="dxa" w:w="160"/>
-            </w:tcMar>
-          </w:tcPr>
-          <w:p>
-            <w:pPr>
-              <w:jc w:val="center"/>
-            </w:pPr>
-            <w:r>
-              <w:rPr>
-                <w:rFonts w:ascii="Arial" w:cs="Arial" w:eastAsia="Arial" w:hAnsi="Arial"/>
-                <w:i/>
-                <w:iCs/>
-                <w:color w:val="757575"/>
-                <w:sz w:val="20"/>
-                <w:szCs w:val="20"/>
-              </w:rPr>
-              <w:t xml:space="preserve">[Pega aquí la captura de pantalla]</w:t>
-            </w:r>
-          </w:p>
-        </w:tc>
-      </w:tr>
-    </w:tbl>
-    <w:p>
-      <w:pPr>
-        <w:spacing w:after="160"/>
-      </w:pPr>
+      <w:r>
+        <w:br w:type="page"/>
+      </w:r>
     </w:p>
     <w:p>
       <w:pPr>
@@ -1694,7 +1614,7 @@
           <w:sz w:val="22"/>
           <w:szCs w:val="22"/>
         </w:rPr>
-        <w:t xml:space="preserve">¿Coincidían tus predicciones con lo que había? Para cada diferencia, di a qué pilar pertenece y si es un problema o una decisión razonable.</w:t>
+        <w:t xml:space="preserve">Una cosa de la ficha que parece un problema y que has decidido no anotar como hallazgo, y por qué.</w:t>
       </w:r>
     </w:p>
     <w:tbl>
@@ -1808,39 +1728,12 @@
           </w:p>
         </w:tc>
       </w:tr>
-      <w:tr>
-        <w:trPr>
-          <w:trHeight w:val="480"/>
-        </w:trPr>
-        <w:tc>
-          <w:tcPr>
-            <w:tcW w:type="dxa" w:w="9638"/>
-            <w:tcBorders>
-              <w:top w:val="single" w:color="E0E0E0" w:sz="4"/>
-              <w:left w:val="single" w:color="E0E0E0" w:sz="4"/>
-              <w:bottom w:val="single" w:color="E0E0E0" w:sz="4"/>
-              <w:right w:val="single" w:color="E0E0E0" w:sz="4"/>
-            </w:tcBorders>
-            <w:shd w:fill="FAFAFA" w:val="clear"/>
-            <w:tcMar>
-              <w:top w:type="dxa" w:w="60"/>
-              <w:left w:type="dxa" w:w="160"/>
-              <w:bottom w:type="dxa" w:w="60"/>
-              <w:right w:type="dxa" w:w="160"/>
-            </w:tcMar>
-          </w:tcPr>
-          <w:p>
-            <w:r>
-              <w:rPr>
-                <w:sz w:val="22"/>
-                <w:szCs w:val="22"/>
-              </w:rPr>
-              <w:t xml:space="preserve"/>
-            </w:r>
-          </w:p>
-        </w:tc>
-      </w:tr>
     </w:tbl>
+    <w:p>
+      <w:pPr>
+        <w:spacing w:after="120"/>
+      </w:pPr>
+    </w:p>
     <w:p>
       <w:pPr>
         <w:pBdr>
@@ -1857,7 +1750,21 @@
           <w:sz w:val="24"/>
           <w:szCs w:val="24"/>
         </w:rPr>
-        <w:t xml:space="preserve">Paso 3 — Pasa los seis pilares por tu inventario</w:t>
+        <w:t xml:space="preserve">Paso 3 — Contrasta, prioriza y acepta un riesgo</w:t>
+      </w:r>
+    </w:p>
+    <w:p>
+      <w:pPr>
+        <w:spacing w:after="100"/>
+      </w:pPr>
+      <w:r>
+        <w:rPr>
+          <w:rFonts w:ascii="Arial" w:cs="Arial" w:eastAsia="Arial" w:hAnsi="Arial"/>
+          <w:color w:val="212121"/>
+          <w:sz w:val="22"/>
+          <w:szCs w:val="22"/>
+        </w:rPr>
+        <w:t xml:space="preserve">Contraste con tus sospechas del Paso 1: qué se ha confirmado, qué no, y qué hallazgos importantes no habías visto.</w:t>
       </w:r>
     </w:p>
     <w:tbl>
@@ -1873,15 +1780,145 @@
         </w:tblBorders>
       </w:tblPr>
       <w:tblGrid>
-        <w:gridCol w:w="1542"/>
+        <w:gridCol w:w="9638"/>
+      </w:tblGrid>
+      <w:tr>
+        <w:trPr>
+          <w:trHeight w:val="480"/>
+        </w:trPr>
+        <w:tc>
+          <w:tcPr>
+            <w:tcW w:type="dxa" w:w="9638"/>
+            <w:tcBorders>
+              <w:top w:val="single" w:color="E0E0E0" w:sz="4"/>
+              <w:left w:val="single" w:color="E0E0E0" w:sz="4"/>
+              <w:bottom w:val="single" w:color="E0E0E0" w:sz="4"/>
+              <w:right w:val="single" w:color="E0E0E0" w:sz="4"/>
+            </w:tcBorders>
+            <w:shd w:fill="FAFAFA" w:val="clear"/>
+            <w:tcMar>
+              <w:top w:type="dxa" w:w="60"/>
+              <w:left w:type="dxa" w:w="160"/>
+              <w:bottom w:type="dxa" w:w="60"/>
+              <w:right w:type="dxa" w:w="160"/>
+            </w:tcMar>
+          </w:tcPr>
+          <w:p>
+            <w:r>
+              <w:rPr>
+                <w:sz w:val="22"/>
+                <w:szCs w:val="22"/>
+              </w:rPr>
+              <w:t xml:space="preserve"/>
+            </w:r>
+          </w:p>
+        </w:tc>
+      </w:tr>
+      <w:tr>
+        <w:trPr>
+          <w:trHeight w:val="480"/>
+        </w:trPr>
+        <w:tc>
+          <w:tcPr>
+            <w:tcW w:type="dxa" w:w="9638"/>
+            <w:tcBorders>
+              <w:top w:val="single" w:color="E0E0E0" w:sz="4"/>
+              <w:left w:val="single" w:color="E0E0E0" w:sz="4"/>
+              <w:bottom w:val="single" w:color="E0E0E0" w:sz="4"/>
+              <w:right w:val="single" w:color="E0E0E0" w:sz="4"/>
+            </w:tcBorders>
+            <w:shd w:fill="FAFAFA" w:val="clear"/>
+            <w:tcMar>
+              <w:top w:type="dxa" w:w="60"/>
+              <w:left w:type="dxa" w:w="160"/>
+              <w:bottom w:type="dxa" w:w="60"/>
+              <w:right w:type="dxa" w:w="160"/>
+            </w:tcMar>
+          </w:tcPr>
+          <w:p>
+            <w:r>
+              <w:rPr>
+                <w:sz w:val="22"/>
+                <w:szCs w:val="22"/>
+              </w:rPr>
+              <w:t xml:space="preserve"/>
+            </w:r>
+          </w:p>
+        </w:tc>
+      </w:tr>
+      <w:tr>
+        <w:trPr>
+          <w:trHeight w:val="480"/>
+        </w:trPr>
+        <w:tc>
+          <w:tcPr>
+            <w:tcW w:type="dxa" w:w="9638"/>
+            <w:tcBorders>
+              <w:top w:val="single" w:color="E0E0E0" w:sz="4"/>
+              <w:left w:val="single" w:color="E0E0E0" w:sz="4"/>
+              <w:bottom w:val="single" w:color="E0E0E0" w:sz="4"/>
+              <w:right w:val="single" w:color="E0E0E0" w:sz="4"/>
+            </w:tcBorders>
+            <w:shd w:fill="FAFAFA" w:val="clear"/>
+            <w:tcMar>
+              <w:top w:type="dxa" w:w="60"/>
+              <w:left w:type="dxa" w:w="160"/>
+              <w:bottom w:type="dxa" w:w="60"/>
+              <w:right w:type="dxa" w:w="160"/>
+            </w:tcMar>
+          </w:tcPr>
+          <w:p>
+            <w:r>
+              <w:rPr>
+                <w:sz w:val="22"/>
+                <w:szCs w:val="22"/>
+              </w:rPr>
+              <w:t xml:space="preserve"/>
+            </w:r>
+          </w:p>
+        </w:tc>
+      </w:tr>
+    </w:tbl>
+    <w:p>
+      <w:pPr>
+        <w:spacing w:after="80"/>
+      </w:pPr>
+    </w:p>
+    <w:p>
+      <w:pPr>
+        <w:spacing w:after="100"/>
+      </w:pPr>
+      <w:r>
+        <w:rPr>
+          <w:rFonts w:ascii="Arial" w:cs="Arial" w:eastAsia="Arial" w:hAnsi="Arial"/>
+          <w:color w:val="212121"/>
+          <w:sz w:val="22"/>
+          <w:szCs w:val="22"/>
+        </w:rPr>
+        <w:t xml:space="preserve">Tus tres hallazgos más urgentes, en orden, según la matriz de impacto y esfuerzo:</w:t>
+      </w:r>
+    </w:p>
+    <w:tbl>
+      <w:tblPr>
+        <w:tblW w:type="dxa" w:w="9638"/>
+        <w:tblBorders>
+          <w:top w:val="single" w:color="auto" w:sz="4"/>
+          <w:left w:val="single" w:color="auto" w:sz="4"/>
+          <w:bottom w:val="single" w:color="auto" w:sz="4"/>
+          <w:right w:val="single" w:color="auto" w:sz="4"/>
+          <w:insideH w:val="single" w:color="auto" w:sz="4"/>
+          <w:insideV w:val="single" w:color="auto" w:sz="4"/>
+        </w:tblBorders>
+      </w:tblPr>
+      <w:tblGrid>
+        <w:gridCol w:w="1349"/>
+        <w:gridCol w:w="3855"/>
         <w:gridCol w:w="4433"/>
-        <w:gridCol w:w="1349"/>
-        <w:gridCol w:w="2313"/>
       </w:tblGrid>
       <w:tr>
         <w:tc>
           <w:tcPr>
-            <w:tcW w:type="dxa" w:w="1542"/>
+            <w:tcW w:type="dxa" w:w="1349"/>
             <w:tcBorders>
               <w:top w:val="single" w:color="E0E0E0" w:sz="4"/>
               <w:left w:val="single" w:color="E0E0E0" w:sz="4"/>
@@ -1909,13 +1946,13 @@
                 <w:sz w:val="20"/>
                 <w:szCs w:val="20"/>
               </w:rPr>
-              <w:t xml:space="preserve">Pilar</w:t>
-            </w:r>
-          </w:p>
-        </w:tc>
-        <w:tc>
-          <w:tcPr>
-            <w:tcW w:type="dxa" w:w="4433"/>
+              <w:t xml:space="preserve">Prioridad</w:t>
+            </w:r>
+          </w:p>
+        </w:tc>
+        <w:tc>
+          <w:tcPr>
+            <w:tcW w:type="dxa" w:w="3855"/>
             <w:tcBorders>
               <w:top w:val="single" w:color="E0E0E0" w:sz="4"/>
               <w:left w:val="single" w:color="E0E0E0" w:sz="4"/>
@@ -1943,13 +1980,13 @@
                 <w:sz w:val="20"/>
                 <w:szCs w:val="20"/>
               </w:rPr>
-              <w:t xml:space="preserve">Hallazgo (o «sin hallazgos» y qué has comprobado)</w:t>
-            </w:r>
-          </w:p>
-        </w:tc>
-        <w:tc>
-          <w:tcPr>
-            <w:tcW w:type="dxa" w:w="1349"/>
+              <w:t xml:space="preserve">Hallazgo</w:t>
+            </w:r>
+          </w:p>
+        </w:tc>
+        <w:tc>
+          <w:tcPr>
+            <w:tcW w:type="dxa" w:w="4433"/>
             <w:tcBorders>
               <w:top w:val="single" w:color="E0E0E0" w:sz="4"/>
               <w:left w:val="single" w:color="E0E0E0" w:sz="4"/>
@@ -1977,41 +2014,7 @@
                 <w:sz w:val="20"/>
                 <w:szCs w:val="20"/>
               </w:rPr>
-              <w:t xml:space="preserve">Impacto</w:t>
-            </w:r>
-          </w:p>
-        </w:tc>
-        <w:tc>
-          <w:tcPr>
-            <w:tcW w:type="dxa" w:w="2313"/>
-            <w:tcBorders>
-              <w:top w:val="single" w:color="E0E0E0" w:sz="4"/>
-              <w:left w:val="single" w:color="E0E0E0" w:sz="4"/>
-              <w:bottom w:val="single" w:color="E0E0E0" w:sz="4"/>
-              <w:right w:val="single" w:color="E0E0E0" w:sz="4"/>
-            </w:tcBorders>
-            <w:shd w:fill="3949AB" w:val="clear"/>
-            <w:tcMar>
-              <w:top w:type="dxa" w:w="100"/>
-              <w:left w:type="dxa" w:w="140"/>
-              <w:bottom w:type="dxa" w:w="100"/>
-              <w:right w:type="dxa" w:w="100"/>
-            </w:tcMar>
-          </w:tcPr>
-          <w:p>
-            <w:pPr>
-              <w:jc w:val="center"/>
-            </w:pPr>
-            <w:r>
-              <w:rPr>
-                <w:rFonts w:ascii="Arial" w:cs="Arial" w:eastAsia="Arial" w:hAnsi="Arial"/>
-                <w:b/>
-                <w:bCs/>
-                <w:color w:val="FFFFFF"/>
-                <w:sz w:val="20"/>
-                <w:szCs w:val="20"/>
-              </w:rPr>
-              <w:t xml:space="preserve">Esfuerzo</w:t>
+              <w:t xml:space="preserve">Qué cambiarías</w:t>
             </w:r>
           </w:p>
         </w:tc>
@@ -2022,7 +2025,7 @@
         </w:trPr>
         <w:tc>
           <w:tcPr>
-            <w:tcW w:type="dxa" w:w="1542"/>
+            <w:tcW w:type="dxa" w:w="1349"/>
             <w:tcBorders>
               <w:top w:val="single" w:color="E0E0E0" w:sz="4"/>
               <w:left w:val="single" w:color="E0E0E0" w:sz="4"/>
@@ -2049,6 +2052,33 @@
         </w:tc>
         <w:tc>
           <w:tcPr>
+            <w:tcW w:type="dxa" w:w="3855"/>
+            <w:tcBorders>
+              <w:top w:val="single" w:color="E0E0E0" w:sz="4"/>
+              <w:left w:val="single" w:color="E0E0E0" w:sz="4"/>
+              <w:bottom w:val="single" w:color="E0E0E0" w:sz="4"/>
+              <w:right w:val="single" w:color="E0E0E0" w:sz="4"/>
+            </w:tcBorders>
+            <w:shd w:fill="FFFFFF" w:val="clear"/>
+            <w:tcMar>
+              <w:top w:type="dxa" w:w="80"/>
+              <w:left w:type="dxa" w:w="140"/>
+              <w:bottom w:type="dxa" w:w="80"/>
+              <w:right w:type="dxa" w:w="100"/>
+            </w:tcMar>
+          </w:tcPr>
+          <w:p>
+            <w:r>
+              <w:rPr>
+                <w:sz w:val="22"/>
+                <w:szCs w:val="22"/>
+              </w:rPr>
+              <w:t xml:space="preserve"/>
+            </w:r>
+          </w:p>
+        </w:tc>
+        <w:tc>
+          <w:tcPr>
             <w:tcW w:type="dxa" w:w="4433"/>
             <w:tcBorders>
               <w:top w:val="single" w:color="E0E0E0" w:sz="4"/>
@@ -2074,6 +2104,11 @@
             </w:r>
           </w:p>
         </w:tc>
+      </w:tr>
+      <w:tr>
+        <w:trPr>
+          <w:trHeight w:val="800"/>
+        </w:trPr>
         <w:tc>
           <w:tcPr>
             <w:tcW w:type="dxa" w:w="1349"/>
@@ -2083,6 +2118,92 @@
               <w:bottom w:val="single" w:color="E0E0E0" w:sz="4"/>
               <w:right w:val="single" w:color="E0E0E0" w:sz="4"/>
             </w:tcBorders>
+            <w:shd w:fill="F5F5F5" w:val="clear"/>
+            <w:tcMar>
+              <w:top w:type="dxa" w:w="80"/>
+              <w:left w:type="dxa" w:w="140"/>
+              <w:bottom w:type="dxa" w:w="80"/>
+              <w:right w:type="dxa" w:w="100"/>
+            </w:tcMar>
+          </w:tcPr>
+          <w:p>
+            <w:r>
+              <w:rPr>
+                <w:sz w:val="22"/>
+                <w:szCs w:val="22"/>
+              </w:rPr>
+              <w:t xml:space="preserve"/>
+            </w:r>
+          </w:p>
+        </w:tc>
+        <w:tc>
+          <w:tcPr>
+            <w:tcW w:type="dxa" w:w="3855"/>
+            <w:tcBorders>
+              <w:top w:val="single" w:color="E0E0E0" w:sz="4"/>
+              <w:left w:val="single" w:color="E0E0E0" w:sz="4"/>
+              <w:bottom w:val="single" w:color="E0E0E0" w:sz="4"/>
+              <w:right w:val="single" w:color="E0E0E0" w:sz="4"/>
+            </w:tcBorders>
+            <w:shd w:fill="F5F5F5" w:val="clear"/>
+            <w:tcMar>
+              <w:top w:type="dxa" w:w="80"/>
+              <w:left w:type="dxa" w:w="140"/>
+              <w:bottom w:type="dxa" w:w="80"/>
+              <w:right w:type="dxa" w:w="100"/>
+            </w:tcMar>
+          </w:tcPr>
+          <w:p>
+            <w:r>
+              <w:rPr>
+                <w:sz w:val="22"/>
+                <w:szCs w:val="22"/>
+              </w:rPr>
+              <w:t xml:space="preserve"/>
+            </w:r>
+          </w:p>
+        </w:tc>
+        <w:tc>
+          <w:tcPr>
+            <w:tcW w:type="dxa" w:w="4433"/>
+            <w:tcBorders>
+              <w:top w:val="single" w:color="E0E0E0" w:sz="4"/>
+              <w:left w:val="single" w:color="E0E0E0" w:sz="4"/>
+              <w:bottom w:val="single" w:color="E0E0E0" w:sz="4"/>
+              <w:right w:val="single" w:color="E0E0E0" w:sz="4"/>
+            </w:tcBorders>
+            <w:shd w:fill="F5F5F5" w:val="clear"/>
+            <w:tcMar>
+              <w:top w:type="dxa" w:w="80"/>
+              <w:left w:type="dxa" w:w="140"/>
+              <w:bottom w:type="dxa" w:w="80"/>
+              <w:right w:type="dxa" w:w="100"/>
+            </w:tcMar>
+          </w:tcPr>
+          <w:p>
+            <w:r>
+              <w:rPr>
+                <w:sz w:val="22"/>
+                <w:szCs w:val="22"/>
+              </w:rPr>
+              <w:t xml:space="preserve"/>
+            </w:r>
+          </w:p>
+        </w:tc>
+      </w:tr>
+      <w:tr>
+        <w:trPr>
+          <w:trHeight w:val="800"/>
+        </w:trPr>
+        <w:tc>
+          <w:tcPr>
+            <w:tcW w:type="dxa" w:w="1349"/>
+            <w:tcBorders>
+              <w:top w:val="single" w:color="E0E0E0" w:sz="4"/>
+              <w:left w:val="single" w:color="E0E0E0" w:sz="4"/>
+              <w:bottom w:val="single" w:color="E0E0E0" w:sz="4"/>
+              <w:right w:val="single" w:color="E0E0E0" w:sz="4"/>
+            </w:tcBorders>
             <w:shd w:fill="FFFFFF" w:val="clear"/>
             <w:tcMar>
               <w:top w:type="dxa" w:w="80"/>
@@ -2103,7 +2224,7 @@
         </w:tc>
         <w:tc>
           <w:tcPr>
-            <w:tcW w:type="dxa" w:w="2313"/>
+            <w:tcW w:type="dxa" w:w="3855"/>
             <w:tcBorders>
               <w:top w:val="single" w:color="E0E0E0" w:sz="4"/>
               <w:left w:val="single" w:color="E0E0E0" w:sz="4"/>
@@ -2128,38 +2249,6 @@
             </w:r>
           </w:p>
         </w:tc>
-      </w:tr>
-      <w:tr>
-        <w:trPr>
-          <w:trHeight w:val="800"/>
-        </w:trPr>
-        <w:tc>
-          <w:tcPr>
-            <w:tcW w:type="dxa" w:w="1542"/>
-            <w:tcBorders>
-              <w:top w:val="single" w:color="E0E0E0" w:sz="4"/>
-              <w:left w:val="single" w:color="E0E0E0" w:sz="4"/>
-              <w:bottom w:val="single" w:color="E0E0E0" w:sz="4"/>
-              <w:right w:val="single" w:color="E0E0E0" w:sz="4"/>
-            </w:tcBorders>
-            <w:shd w:fill="F5F5F5" w:val="clear"/>
-            <w:tcMar>
-              <w:top w:type="dxa" w:w="80"/>
-              <w:left w:type="dxa" w:w="140"/>
-              <w:bottom w:type="dxa" w:w="80"/>
-              <w:right w:type="dxa" w:w="100"/>
-            </w:tcMar>
-          </w:tcPr>
-          <w:p>
-            <w:r>
-              <w:rPr>
-                <w:sz w:val="22"/>
-                <w:szCs w:val="22"/>
-              </w:rPr>
-              <w:t xml:space="preserve"/>
-            </w:r>
-          </w:p>
-        </w:tc>
         <w:tc>
           <w:tcPr>
             <w:tcW w:type="dxa" w:w="4433"/>
@@ -2169,739 +2258,7 @@
               <w:bottom w:val="single" w:color="E0E0E0" w:sz="4"/>
               <w:right w:val="single" w:color="E0E0E0" w:sz="4"/>
             </w:tcBorders>
-            <w:shd w:fill="F5F5F5" w:val="clear"/>
-            <w:tcMar>
-              <w:top w:type="dxa" w:w="80"/>
-              <w:left w:type="dxa" w:w="140"/>
-              <w:bottom w:type="dxa" w:w="80"/>
-              <w:right w:type="dxa" w:w="100"/>
-            </w:tcMar>
-          </w:tcPr>
-          <w:p>
-            <w:r>
-              <w:rPr>
-                <w:sz w:val="22"/>
-                <w:szCs w:val="22"/>
-              </w:rPr>
-              <w:t xml:space="preserve"/>
-            </w:r>
-          </w:p>
-        </w:tc>
-        <w:tc>
-          <w:tcPr>
-            <w:tcW w:type="dxa" w:w="1349"/>
-            <w:tcBorders>
-              <w:top w:val="single" w:color="E0E0E0" w:sz="4"/>
-              <w:left w:val="single" w:color="E0E0E0" w:sz="4"/>
-              <w:bottom w:val="single" w:color="E0E0E0" w:sz="4"/>
-              <w:right w:val="single" w:color="E0E0E0" w:sz="4"/>
-            </w:tcBorders>
-            <w:shd w:fill="F5F5F5" w:val="clear"/>
-            <w:tcMar>
-              <w:top w:type="dxa" w:w="80"/>
-              <w:left w:type="dxa" w:w="140"/>
-              <w:bottom w:type="dxa" w:w="80"/>
-              <w:right w:type="dxa" w:w="100"/>
-            </w:tcMar>
-          </w:tcPr>
-          <w:p>
-            <w:r>
-              <w:rPr>
-                <w:sz w:val="22"/>
-                <w:szCs w:val="22"/>
-              </w:rPr>
-              <w:t xml:space="preserve"/>
-            </w:r>
-          </w:p>
-        </w:tc>
-        <w:tc>
-          <w:tcPr>
-            <w:tcW w:type="dxa" w:w="2313"/>
-            <w:tcBorders>
-              <w:top w:val="single" w:color="E0E0E0" w:sz="4"/>
-              <w:left w:val="single" w:color="E0E0E0" w:sz="4"/>
-              <w:bottom w:val="single" w:color="E0E0E0" w:sz="4"/>
-              <w:right w:val="single" w:color="E0E0E0" w:sz="4"/>
-            </w:tcBorders>
-            <w:shd w:fill="F5F5F5" w:val="clear"/>
-            <w:tcMar>
-              <w:top w:type="dxa" w:w="80"/>
-              <w:left w:type="dxa" w:w="140"/>
-              <w:bottom w:type="dxa" w:w="80"/>
-              <w:right w:type="dxa" w:w="100"/>
-            </w:tcMar>
-          </w:tcPr>
-          <w:p>
-            <w:r>
-              <w:rPr>
-                <w:sz w:val="22"/>
-                <w:szCs w:val="22"/>
-              </w:rPr>
-              <w:t xml:space="preserve"/>
-            </w:r>
-          </w:p>
-        </w:tc>
-      </w:tr>
-      <w:tr>
-        <w:trPr>
-          <w:trHeight w:val="800"/>
-        </w:trPr>
-        <w:tc>
-          <w:tcPr>
-            <w:tcW w:type="dxa" w:w="1542"/>
-            <w:tcBorders>
-              <w:top w:val="single" w:color="E0E0E0" w:sz="4"/>
-              <w:left w:val="single" w:color="E0E0E0" w:sz="4"/>
-              <w:bottom w:val="single" w:color="E0E0E0" w:sz="4"/>
-              <w:right w:val="single" w:color="E0E0E0" w:sz="4"/>
-            </w:tcBorders>
             <w:shd w:fill="FFFFFF" w:val="clear"/>
-            <w:tcMar>
-              <w:top w:type="dxa" w:w="80"/>
-              <w:left w:type="dxa" w:w="140"/>
-              <w:bottom w:type="dxa" w:w="80"/>
-              <w:right w:type="dxa" w:w="100"/>
-            </w:tcMar>
-          </w:tcPr>
-          <w:p>
-            <w:r>
-              <w:rPr>
-                <w:sz w:val="22"/>
-                <w:szCs w:val="22"/>
-              </w:rPr>
-              <w:t xml:space="preserve"/>
-            </w:r>
-          </w:p>
-        </w:tc>
-        <w:tc>
-          <w:tcPr>
-            <w:tcW w:type="dxa" w:w="4433"/>
-            <w:tcBorders>
-              <w:top w:val="single" w:color="E0E0E0" w:sz="4"/>
-              <w:left w:val="single" w:color="E0E0E0" w:sz="4"/>
-              <w:bottom w:val="single" w:color="E0E0E0" w:sz="4"/>
-              <w:right w:val="single" w:color="E0E0E0" w:sz="4"/>
-            </w:tcBorders>
-            <w:shd w:fill="FFFFFF" w:val="clear"/>
-            <w:tcMar>
-              <w:top w:type="dxa" w:w="80"/>
-              <w:left w:type="dxa" w:w="140"/>
-              <w:bottom w:type="dxa" w:w="80"/>
-              <w:right w:type="dxa" w:w="100"/>
-            </w:tcMar>
-          </w:tcPr>
-          <w:p>
-            <w:r>
-              <w:rPr>
-                <w:sz w:val="22"/>
-                <w:szCs w:val="22"/>
-              </w:rPr>
-              <w:t xml:space="preserve"/>
-            </w:r>
-          </w:p>
-        </w:tc>
-        <w:tc>
-          <w:tcPr>
-            <w:tcW w:type="dxa" w:w="1349"/>
-            <w:tcBorders>
-              <w:top w:val="single" w:color="E0E0E0" w:sz="4"/>
-              <w:left w:val="single" w:color="E0E0E0" w:sz="4"/>
-              <w:bottom w:val="single" w:color="E0E0E0" w:sz="4"/>
-              <w:right w:val="single" w:color="E0E0E0" w:sz="4"/>
-            </w:tcBorders>
-            <w:shd w:fill="FFFFFF" w:val="clear"/>
-            <w:tcMar>
-              <w:top w:type="dxa" w:w="80"/>
-              <w:left w:type="dxa" w:w="140"/>
-              <w:bottom w:type="dxa" w:w="80"/>
-              <w:right w:type="dxa" w:w="100"/>
-            </w:tcMar>
-          </w:tcPr>
-          <w:p>
-            <w:r>
-              <w:rPr>
-                <w:sz w:val="22"/>
-                <w:szCs w:val="22"/>
-              </w:rPr>
-              <w:t xml:space="preserve"/>
-            </w:r>
-          </w:p>
-        </w:tc>
-        <w:tc>
-          <w:tcPr>
-            <w:tcW w:type="dxa" w:w="2313"/>
-            <w:tcBorders>
-              <w:top w:val="single" w:color="E0E0E0" w:sz="4"/>
-              <w:left w:val="single" w:color="E0E0E0" w:sz="4"/>
-              <w:bottom w:val="single" w:color="E0E0E0" w:sz="4"/>
-              <w:right w:val="single" w:color="E0E0E0" w:sz="4"/>
-            </w:tcBorders>
-            <w:shd w:fill="FFFFFF" w:val="clear"/>
-            <w:tcMar>
-              <w:top w:type="dxa" w:w="80"/>
-              <w:left w:type="dxa" w:w="140"/>
-              <w:bottom w:type="dxa" w:w="80"/>
-              <w:right w:type="dxa" w:w="100"/>
-            </w:tcMar>
-          </w:tcPr>
-          <w:p>
-            <w:r>
-              <w:rPr>
-                <w:sz w:val="22"/>
-                <w:szCs w:val="22"/>
-              </w:rPr>
-              <w:t xml:space="preserve"/>
-            </w:r>
-          </w:p>
-        </w:tc>
-      </w:tr>
-      <w:tr>
-        <w:trPr>
-          <w:trHeight w:val="800"/>
-        </w:trPr>
-        <w:tc>
-          <w:tcPr>
-            <w:tcW w:type="dxa" w:w="1542"/>
-            <w:tcBorders>
-              <w:top w:val="single" w:color="E0E0E0" w:sz="4"/>
-              <w:left w:val="single" w:color="E0E0E0" w:sz="4"/>
-              <w:bottom w:val="single" w:color="E0E0E0" w:sz="4"/>
-              <w:right w:val="single" w:color="E0E0E0" w:sz="4"/>
-            </w:tcBorders>
-            <w:shd w:fill="F5F5F5" w:val="clear"/>
-            <w:tcMar>
-              <w:top w:type="dxa" w:w="80"/>
-              <w:left w:type="dxa" w:w="140"/>
-              <w:bottom w:type="dxa" w:w="80"/>
-              <w:right w:type="dxa" w:w="100"/>
-            </w:tcMar>
-          </w:tcPr>
-          <w:p>
-            <w:r>
-              <w:rPr>
-                <w:sz w:val="22"/>
-                <w:szCs w:val="22"/>
-              </w:rPr>
-              <w:t xml:space="preserve"/>
-            </w:r>
-          </w:p>
-        </w:tc>
-        <w:tc>
-          <w:tcPr>
-            <w:tcW w:type="dxa" w:w="4433"/>
-            <w:tcBorders>
-              <w:top w:val="single" w:color="E0E0E0" w:sz="4"/>
-              <w:left w:val="single" w:color="E0E0E0" w:sz="4"/>
-              <w:bottom w:val="single" w:color="E0E0E0" w:sz="4"/>
-              <w:right w:val="single" w:color="E0E0E0" w:sz="4"/>
-            </w:tcBorders>
-            <w:shd w:fill="F5F5F5" w:val="clear"/>
-            <w:tcMar>
-              <w:top w:type="dxa" w:w="80"/>
-              <w:left w:type="dxa" w:w="140"/>
-              <w:bottom w:type="dxa" w:w="80"/>
-              <w:right w:type="dxa" w:w="100"/>
-            </w:tcMar>
-          </w:tcPr>
-          <w:p>
-            <w:r>
-              <w:rPr>
-                <w:sz w:val="22"/>
-                <w:szCs w:val="22"/>
-              </w:rPr>
-              <w:t xml:space="preserve"/>
-            </w:r>
-          </w:p>
-        </w:tc>
-        <w:tc>
-          <w:tcPr>
-            <w:tcW w:type="dxa" w:w="1349"/>
-            <w:tcBorders>
-              <w:top w:val="single" w:color="E0E0E0" w:sz="4"/>
-              <w:left w:val="single" w:color="E0E0E0" w:sz="4"/>
-              <w:bottom w:val="single" w:color="E0E0E0" w:sz="4"/>
-              <w:right w:val="single" w:color="E0E0E0" w:sz="4"/>
-            </w:tcBorders>
-            <w:shd w:fill="F5F5F5" w:val="clear"/>
-            <w:tcMar>
-              <w:top w:type="dxa" w:w="80"/>
-              <w:left w:type="dxa" w:w="140"/>
-              <w:bottom w:type="dxa" w:w="80"/>
-              <w:right w:type="dxa" w:w="100"/>
-            </w:tcMar>
-          </w:tcPr>
-          <w:p>
-            <w:r>
-              <w:rPr>
-                <w:sz w:val="22"/>
-                <w:szCs w:val="22"/>
-              </w:rPr>
-              <w:t xml:space="preserve"/>
-            </w:r>
-          </w:p>
-        </w:tc>
-        <w:tc>
-          <w:tcPr>
-            <w:tcW w:type="dxa" w:w="2313"/>
-            <w:tcBorders>
-              <w:top w:val="single" w:color="E0E0E0" w:sz="4"/>
-              <w:left w:val="single" w:color="E0E0E0" w:sz="4"/>
-              <w:bottom w:val="single" w:color="E0E0E0" w:sz="4"/>
-              <w:right w:val="single" w:color="E0E0E0" w:sz="4"/>
-            </w:tcBorders>
-            <w:shd w:fill="F5F5F5" w:val="clear"/>
-            <w:tcMar>
-              <w:top w:type="dxa" w:w="80"/>
-              <w:left w:type="dxa" w:w="140"/>
-              <w:bottom w:type="dxa" w:w="80"/>
-              <w:right w:type="dxa" w:w="100"/>
-            </w:tcMar>
-          </w:tcPr>
-          <w:p>
-            <w:r>
-              <w:rPr>
-                <w:sz w:val="22"/>
-                <w:szCs w:val="22"/>
-              </w:rPr>
-              <w:t xml:space="preserve"/>
-            </w:r>
-          </w:p>
-        </w:tc>
-      </w:tr>
-      <w:tr>
-        <w:trPr>
-          <w:trHeight w:val="800"/>
-        </w:trPr>
-        <w:tc>
-          <w:tcPr>
-            <w:tcW w:type="dxa" w:w="1542"/>
-            <w:tcBorders>
-              <w:top w:val="single" w:color="E0E0E0" w:sz="4"/>
-              <w:left w:val="single" w:color="E0E0E0" w:sz="4"/>
-              <w:bottom w:val="single" w:color="E0E0E0" w:sz="4"/>
-              <w:right w:val="single" w:color="E0E0E0" w:sz="4"/>
-            </w:tcBorders>
-            <w:shd w:fill="FFFFFF" w:val="clear"/>
-            <w:tcMar>
-              <w:top w:type="dxa" w:w="80"/>
-              <w:left w:type="dxa" w:w="140"/>
-              <w:bottom w:type="dxa" w:w="80"/>
-              <w:right w:type="dxa" w:w="100"/>
-            </w:tcMar>
-          </w:tcPr>
-          <w:p>
-            <w:r>
-              <w:rPr>
-                <w:sz w:val="22"/>
-                <w:szCs w:val="22"/>
-              </w:rPr>
-              <w:t xml:space="preserve"/>
-            </w:r>
-          </w:p>
-        </w:tc>
-        <w:tc>
-          <w:tcPr>
-            <w:tcW w:type="dxa" w:w="4433"/>
-            <w:tcBorders>
-              <w:top w:val="single" w:color="E0E0E0" w:sz="4"/>
-              <w:left w:val="single" w:color="E0E0E0" w:sz="4"/>
-              <w:bottom w:val="single" w:color="E0E0E0" w:sz="4"/>
-              <w:right w:val="single" w:color="E0E0E0" w:sz="4"/>
-            </w:tcBorders>
-            <w:shd w:fill="FFFFFF" w:val="clear"/>
-            <w:tcMar>
-              <w:top w:type="dxa" w:w="80"/>
-              <w:left w:type="dxa" w:w="140"/>
-              <w:bottom w:type="dxa" w:w="80"/>
-              <w:right w:type="dxa" w:w="100"/>
-            </w:tcMar>
-          </w:tcPr>
-          <w:p>
-            <w:r>
-              <w:rPr>
-                <w:sz w:val="22"/>
-                <w:szCs w:val="22"/>
-              </w:rPr>
-              <w:t xml:space="preserve"/>
-            </w:r>
-          </w:p>
-        </w:tc>
-        <w:tc>
-          <w:tcPr>
-            <w:tcW w:type="dxa" w:w="1349"/>
-            <w:tcBorders>
-              <w:top w:val="single" w:color="E0E0E0" w:sz="4"/>
-              <w:left w:val="single" w:color="E0E0E0" w:sz="4"/>
-              <w:bottom w:val="single" w:color="E0E0E0" w:sz="4"/>
-              <w:right w:val="single" w:color="E0E0E0" w:sz="4"/>
-            </w:tcBorders>
-            <w:shd w:fill="FFFFFF" w:val="clear"/>
-            <w:tcMar>
-              <w:top w:type="dxa" w:w="80"/>
-              <w:left w:type="dxa" w:w="140"/>
-              <w:bottom w:type="dxa" w:w="80"/>
-              <w:right w:type="dxa" w:w="100"/>
-            </w:tcMar>
-          </w:tcPr>
-          <w:p>
-            <w:r>
-              <w:rPr>
-                <w:sz w:val="22"/>
-                <w:szCs w:val="22"/>
-              </w:rPr>
-              <w:t xml:space="preserve"/>
-            </w:r>
-          </w:p>
-        </w:tc>
-        <w:tc>
-          <w:tcPr>
-            <w:tcW w:type="dxa" w:w="2313"/>
-            <w:tcBorders>
-              <w:top w:val="single" w:color="E0E0E0" w:sz="4"/>
-              <w:left w:val="single" w:color="E0E0E0" w:sz="4"/>
-              <w:bottom w:val="single" w:color="E0E0E0" w:sz="4"/>
-              <w:right w:val="single" w:color="E0E0E0" w:sz="4"/>
-            </w:tcBorders>
-            <w:shd w:fill="FFFFFF" w:val="clear"/>
-            <w:tcMar>
-              <w:top w:type="dxa" w:w="80"/>
-              <w:left w:type="dxa" w:w="140"/>
-              <w:bottom w:type="dxa" w:w="80"/>
-              <w:right w:type="dxa" w:w="100"/>
-            </w:tcMar>
-          </w:tcPr>
-          <w:p>
-            <w:r>
-              <w:rPr>
-                <w:sz w:val="22"/>
-                <w:szCs w:val="22"/>
-              </w:rPr>
-              <w:t xml:space="preserve"/>
-            </w:r>
-          </w:p>
-        </w:tc>
-      </w:tr>
-      <w:tr>
-        <w:trPr>
-          <w:trHeight w:val="800"/>
-        </w:trPr>
-        <w:tc>
-          <w:tcPr>
-            <w:tcW w:type="dxa" w:w="1542"/>
-            <w:tcBorders>
-              <w:top w:val="single" w:color="E0E0E0" w:sz="4"/>
-              <w:left w:val="single" w:color="E0E0E0" w:sz="4"/>
-              <w:bottom w:val="single" w:color="E0E0E0" w:sz="4"/>
-              <w:right w:val="single" w:color="E0E0E0" w:sz="4"/>
-            </w:tcBorders>
-            <w:shd w:fill="F5F5F5" w:val="clear"/>
-            <w:tcMar>
-              <w:top w:type="dxa" w:w="80"/>
-              <w:left w:type="dxa" w:w="140"/>
-              <w:bottom w:type="dxa" w:w="80"/>
-              <w:right w:type="dxa" w:w="100"/>
-            </w:tcMar>
-          </w:tcPr>
-          <w:p>
-            <w:r>
-              <w:rPr>
-                <w:sz w:val="22"/>
-                <w:szCs w:val="22"/>
-              </w:rPr>
-              <w:t xml:space="preserve"/>
-            </w:r>
-          </w:p>
-        </w:tc>
-        <w:tc>
-          <w:tcPr>
-            <w:tcW w:type="dxa" w:w="4433"/>
-            <w:tcBorders>
-              <w:top w:val="single" w:color="E0E0E0" w:sz="4"/>
-              <w:left w:val="single" w:color="E0E0E0" w:sz="4"/>
-              <w:bottom w:val="single" w:color="E0E0E0" w:sz="4"/>
-              <w:right w:val="single" w:color="E0E0E0" w:sz="4"/>
-            </w:tcBorders>
-            <w:shd w:fill="F5F5F5" w:val="clear"/>
-            <w:tcMar>
-              <w:top w:type="dxa" w:w="80"/>
-              <w:left w:type="dxa" w:w="140"/>
-              <w:bottom w:type="dxa" w:w="80"/>
-              <w:right w:type="dxa" w:w="100"/>
-            </w:tcMar>
-          </w:tcPr>
-          <w:p>
-            <w:r>
-              <w:rPr>
-                <w:sz w:val="22"/>
-                <w:szCs w:val="22"/>
-              </w:rPr>
-              <w:t xml:space="preserve"/>
-            </w:r>
-          </w:p>
-        </w:tc>
-        <w:tc>
-          <w:tcPr>
-            <w:tcW w:type="dxa" w:w="1349"/>
-            <w:tcBorders>
-              <w:top w:val="single" w:color="E0E0E0" w:sz="4"/>
-              <w:left w:val="single" w:color="E0E0E0" w:sz="4"/>
-              <w:bottom w:val="single" w:color="E0E0E0" w:sz="4"/>
-              <w:right w:val="single" w:color="E0E0E0" w:sz="4"/>
-            </w:tcBorders>
-            <w:shd w:fill="F5F5F5" w:val="clear"/>
-            <w:tcMar>
-              <w:top w:type="dxa" w:w="80"/>
-              <w:left w:type="dxa" w:w="140"/>
-              <w:bottom w:type="dxa" w:w="80"/>
-              <w:right w:type="dxa" w:w="100"/>
-            </w:tcMar>
-          </w:tcPr>
-          <w:p>
-            <w:r>
-              <w:rPr>
-                <w:sz w:val="22"/>
-                <w:szCs w:val="22"/>
-              </w:rPr>
-              <w:t xml:space="preserve"/>
-            </w:r>
-          </w:p>
-        </w:tc>
-        <w:tc>
-          <w:tcPr>
-            <w:tcW w:type="dxa" w:w="2313"/>
-            <w:tcBorders>
-              <w:top w:val="single" w:color="E0E0E0" w:sz="4"/>
-              <w:left w:val="single" w:color="E0E0E0" w:sz="4"/>
-              <w:bottom w:val="single" w:color="E0E0E0" w:sz="4"/>
-              <w:right w:val="single" w:color="E0E0E0" w:sz="4"/>
-            </w:tcBorders>
-            <w:shd w:fill="F5F5F5" w:val="clear"/>
-            <w:tcMar>
-              <w:top w:type="dxa" w:w="80"/>
-              <w:left w:type="dxa" w:w="140"/>
-              <w:bottom w:type="dxa" w:w="80"/>
-              <w:right w:type="dxa" w:w="100"/>
-            </w:tcMar>
-          </w:tcPr>
-          <w:p>
-            <w:r>
-              <w:rPr>
-                <w:sz w:val="22"/>
-                <w:szCs w:val="22"/>
-              </w:rPr>
-              <w:t xml:space="preserve"/>
-            </w:r>
-          </w:p>
-        </w:tc>
-      </w:tr>
-      <w:tr>
-        <w:trPr>
-          <w:trHeight w:val="800"/>
-        </w:trPr>
-        <w:tc>
-          <w:tcPr>
-            <w:tcW w:type="dxa" w:w="1542"/>
-            <w:tcBorders>
-              <w:top w:val="single" w:color="E0E0E0" w:sz="4"/>
-              <w:left w:val="single" w:color="E0E0E0" w:sz="4"/>
-              <w:bottom w:val="single" w:color="E0E0E0" w:sz="4"/>
-              <w:right w:val="single" w:color="E0E0E0" w:sz="4"/>
-            </w:tcBorders>
-            <w:shd w:fill="FFFFFF" w:val="clear"/>
-            <w:tcMar>
-              <w:top w:type="dxa" w:w="80"/>
-              <w:left w:type="dxa" w:w="140"/>
-              <w:bottom w:type="dxa" w:w="80"/>
-              <w:right w:type="dxa" w:w="100"/>
-            </w:tcMar>
-          </w:tcPr>
-          <w:p>
-            <w:r>
-              <w:rPr>
-                <w:sz w:val="22"/>
-                <w:szCs w:val="22"/>
-              </w:rPr>
-              <w:t xml:space="preserve"/>
-            </w:r>
-          </w:p>
-        </w:tc>
-        <w:tc>
-          <w:tcPr>
-            <w:tcW w:type="dxa" w:w="4433"/>
-            <w:tcBorders>
-              <w:top w:val="single" w:color="E0E0E0" w:sz="4"/>
-              <w:left w:val="single" w:color="E0E0E0" w:sz="4"/>
-              <w:bottom w:val="single" w:color="E0E0E0" w:sz="4"/>
-              <w:right w:val="single" w:color="E0E0E0" w:sz="4"/>
-            </w:tcBorders>
-            <w:shd w:fill="FFFFFF" w:val="clear"/>
-            <w:tcMar>
-              <w:top w:type="dxa" w:w="80"/>
-              <w:left w:type="dxa" w:w="140"/>
-              <w:bottom w:type="dxa" w:w="80"/>
-              <w:right w:type="dxa" w:w="100"/>
-            </w:tcMar>
-          </w:tcPr>
-          <w:p>
-            <w:r>
-              <w:rPr>
-                <w:sz w:val="22"/>
-                <w:szCs w:val="22"/>
-              </w:rPr>
-              <w:t xml:space="preserve"/>
-            </w:r>
-          </w:p>
-        </w:tc>
-        <w:tc>
-          <w:tcPr>
-            <w:tcW w:type="dxa" w:w="1349"/>
-            <w:tcBorders>
-              <w:top w:val="single" w:color="E0E0E0" w:sz="4"/>
-              <w:left w:val="single" w:color="E0E0E0" w:sz="4"/>
-              <w:bottom w:val="single" w:color="E0E0E0" w:sz="4"/>
-              <w:right w:val="single" w:color="E0E0E0" w:sz="4"/>
-            </w:tcBorders>
-            <w:shd w:fill="FFFFFF" w:val="clear"/>
-            <w:tcMar>
-              <w:top w:type="dxa" w:w="80"/>
-              <w:left w:type="dxa" w:w="140"/>
-              <w:bottom w:type="dxa" w:w="80"/>
-              <w:right w:type="dxa" w:w="100"/>
-            </w:tcMar>
-          </w:tcPr>
-          <w:p>
-            <w:r>
-              <w:rPr>
-                <w:sz w:val="22"/>
-                <w:szCs w:val="22"/>
-              </w:rPr>
-              <w:t xml:space="preserve"/>
-            </w:r>
-          </w:p>
-        </w:tc>
-        <w:tc>
-          <w:tcPr>
-            <w:tcW w:type="dxa" w:w="2313"/>
-            <w:tcBorders>
-              <w:top w:val="single" w:color="E0E0E0" w:sz="4"/>
-              <w:left w:val="single" w:color="E0E0E0" w:sz="4"/>
-              <w:bottom w:val="single" w:color="E0E0E0" w:sz="4"/>
-              <w:right w:val="single" w:color="E0E0E0" w:sz="4"/>
-            </w:tcBorders>
-            <w:shd w:fill="FFFFFF" w:val="clear"/>
-            <w:tcMar>
-              <w:top w:type="dxa" w:w="80"/>
-              <w:left w:type="dxa" w:w="140"/>
-              <w:bottom w:type="dxa" w:w="80"/>
-              <w:right w:type="dxa" w:w="100"/>
-            </w:tcMar>
-          </w:tcPr>
-          <w:p>
-            <w:r>
-              <w:rPr>
-                <w:sz w:val="22"/>
-                <w:szCs w:val="22"/>
-              </w:rPr>
-              <w:t xml:space="preserve"/>
-            </w:r>
-          </w:p>
-        </w:tc>
-      </w:tr>
-      <w:tr>
-        <w:trPr>
-          <w:trHeight w:val="800"/>
-        </w:trPr>
-        <w:tc>
-          <w:tcPr>
-            <w:tcW w:type="dxa" w:w="1542"/>
-            <w:tcBorders>
-              <w:top w:val="single" w:color="E0E0E0" w:sz="4"/>
-              <w:left w:val="single" w:color="E0E0E0" w:sz="4"/>
-              <w:bottom w:val="single" w:color="E0E0E0" w:sz="4"/>
-              <w:right w:val="single" w:color="E0E0E0" w:sz="4"/>
-            </w:tcBorders>
-            <w:shd w:fill="F5F5F5" w:val="clear"/>
-            <w:tcMar>
-              <w:top w:type="dxa" w:w="80"/>
-              <w:left w:type="dxa" w:w="140"/>
-              <w:bottom w:type="dxa" w:w="80"/>
-              <w:right w:type="dxa" w:w="100"/>
-            </w:tcMar>
-          </w:tcPr>
-          <w:p>
-            <w:r>
-              <w:rPr>
-                <w:sz w:val="22"/>
-                <w:szCs w:val="22"/>
-              </w:rPr>
-              <w:t xml:space="preserve"/>
-            </w:r>
-          </w:p>
-        </w:tc>
-        <w:tc>
-          <w:tcPr>
-            <w:tcW w:type="dxa" w:w="4433"/>
-            <w:tcBorders>
-              <w:top w:val="single" w:color="E0E0E0" w:sz="4"/>
-              <w:left w:val="single" w:color="E0E0E0" w:sz="4"/>
-              <w:bottom w:val="single" w:color="E0E0E0" w:sz="4"/>
-              <w:right w:val="single" w:color="E0E0E0" w:sz="4"/>
-            </w:tcBorders>
-            <w:shd w:fill="F5F5F5" w:val="clear"/>
-            <w:tcMar>
-              <w:top w:type="dxa" w:w="80"/>
-              <w:left w:type="dxa" w:w="140"/>
-              <w:bottom w:type="dxa" w:w="80"/>
-              <w:right w:type="dxa" w:w="100"/>
-            </w:tcMar>
-          </w:tcPr>
-          <w:p>
-            <w:r>
-              <w:rPr>
-                <w:sz w:val="22"/>
-                <w:szCs w:val="22"/>
-              </w:rPr>
-              <w:t xml:space="preserve"/>
-            </w:r>
-          </w:p>
-        </w:tc>
-        <w:tc>
-          <w:tcPr>
-            <w:tcW w:type="dxa" w:w="1349"/>
-            <w:tcBorders>
-              <w:top w:val="single" w:color="E0E0E0" w:sz="4"/>
-              <w:left w:val="single" w:color="E0E0E0" w:sz="4"/>
-              <w:bottom w:val="single" w:color="E0E0E0" w:sz="4"/>
-              <w:right w:val="single" w:color="E0E0E0" w:sz="4"/>
-            </w:tcBorders>
-            <w:shd w:fill="F5F5F5" w:val="clear"/>
-            <w:tcMar>
-              <w:top w:type="dxa" w:w="80"/>
-              <w:left w:type="dxa" w:w="140"/>
-              <w:bottom w:type="dxa" w:w="80"/>
-              <w:right w:type="dxa" w:w="100"/>
-            </w:tcMar>
-          </w:tcPr>
-          <w:p>
-            <w:r>
-              <w:rPr>
-                <w:sz w:val="22"/>
-                <w:szCs w:val="22"/>
-              </w:rPr>
-              <w:t xml:space="preserve"/>
-            </w:r>
-          </w:p>
-        </w:tc>
-        <w:tc>
-          <w:tcPr>
-            <w:tcW w:type="dxa" w:w="2313"/>
-            <w:tcBorders>
-              <w:top w:val="single" w:color="E0E0E0" w:sz="4"/>
-              <w:left w:val="single" w:color="E0E0E0" w:sz="4"/>
-              <w:bottom w:val="single" w:color="E0E0E0" w:sz="4"/>
-              <w:right w:val="single" w:color="E0E0E0" w:sz="4"/>
-            </w:tcBorders>
-            <w:shd w:fill="F5F5F5" w:val="clear"/>
             <w:tcMar>
               <w:top w:type="dxa" w:w="80"/>
               <w:left w:type="dxa" w:w="140"/>
@@ -2923,8 +2280,139 @@
     </w:tbl>
     <w:p>
       <w:pPr>
-        <w:spacing w:after="160"/>
+        <w:spacing w:after="80"/>
       </w:pPr>
+    </w:p>
+    <w:p>
+      <w:pPr>
+        <w:spacing w:after="100"/>
+      </w:pPr>
+      <w:r>
+        <w:rPr>
+          <w:rFonts w:ascii="Arial" w:cs="Arial" w:eastAsia="Arial" w:hAnsi="Arial"/>
+          <w:color w:val="212121"/>
+          <w:sz w:val="22"/>
+          <w:szCs w:val="22"/>
+        </w:rPr>
+        <w:t xml:space="preserve">Un hallazgo que aceptarías sin corregir: qué riesgo es, por qué no se corrige y hasta cuándo.</w:t>
+      </w:r>
+    </w:p>
+    <w:tbl>
+      <w:tblPr>
+        <w:tblW w:type="dxa" w:w="9638"/>
+        <w:tblBorders>
+          <w:top w:val="single" w:color="auto" w:sz="4"/>
+          <w:left w:val="single" w:color="auto" w:sz="4"/>
+          <w:bottom w:val="single" w:color="auto" w:sz="4"/>
+          <w:right w:val="single" w:color="auto" w:sz="4"/>
+          <w:insideH w:val="single" w:color="auto" w:sz="4"/>
+          <w:insideV w:val="single" w:color="auto" w:sz="4"/>
+        </w:tblBorders>
+      </w:tblPr>
+      <w:tblGrid>
+        <w:gridCol w:w="9638"/>
+      </w:tblGrid>
+      <w:tr>
+        <w:trPr>
+          <w:trHeight w:val="480"/>
+        </w:trPr>
+        <w:tc>
+          <w:tcPr>
+            <w:tcW w:type="dxa" w:w="9638"/>
+            <w:tcBorders>
+              <w:top w:val="single" w:color="E0E0E0" w:sz="4"/>
+              <w:left w:val="single" w:color="E0E0E0" w:sz="4"/>
+              <w:bottom w:val="single" w:color="E0E0E0" w:sz="4"/>
+              <w:right w:val="single" w:color="E0E0E0" w:sz="4"/>
+            </w:tcBorders>
+            <w:shd w:fill="FAFAFA" w:val="clear"/>
+            <w:tcMar>
+              <w:top w:type="dxa" w:w="60"/>
+              <w:left w:type="dxa" w:w="160"/>
+              <w:bottom w:type="dxa" w:w="60"/>
+              <w:right w:type="dxa" w:w="160"/>
+            </w:tcMar>
+          </w:tcPr>
+          <w:p>
+            <w:r>
+              <w:rPr>
+                <w:sz w:val="22"/>
+                <w:szCs w:val="22"/>
+              </w:rPr>
+              <w:t xml:space="preserve"/>
+            </w:r>
+          </w:p>
+        </w:tc>
+      </w:tr>
+      <w:tr>
+        <w:trPr>
+          <w:trHeight w:val="480"/>
+        </w:trPr>
+        <w:tc>
+          <w:tcPr>
+            <w:tcW w:type="dxa" w:w="9638"/>
+            <w:tcBorders>
+              <w:top w:val="single" w:color="E0E0E0" w:sz="4"/>
+              <w:left w:val="single" w:color="E0E0E0" w:sz="4"/>
+              <w:bottom w:val="single" w:color="E0E0E0" w:sz="4"/>
+              <w:right w:val="single" w:color="E0E0E0" w:sz="4"/>
+            </w:tcBorders>
+            <w:shd w:fill="FAFAFA" w:val="clear"/>
+            <w:tcMar>
+              <w:top w:type="dxa" w:w="60"/>
+              <w:left w:type="dxa" w:w="160"/>
+              <w:bottom w:type="dxa" w:w="60"/>
+              <w:right w:type="dxa" w:w="160"/>
+            </w:tcMar>
+          </w:tcPr>
+          <w:p>
+            <w:r>
+              <w:rPr>
+                <w:sz w:val="22"/>
+                <w:szCs w:val="22"/>
+              </w:rPr>
+              <w:t xml:space="preserve"/>
+            </w:r>
+          </w:p>
+        </w:tc>
+      </w:tr>
+      <w:tr>
+        <w:trPr>
+          <w:trHeight w:val="480"/>
+        </w:trPr>
+        <w:tc>
+          <w:tcPr>
+            <w:tcW w:type="dxa" w:w="9638"/>
+            <w:tcBorders>
+              <w:top w:val="single" w:color="E0E0E0" w:sz="4"/>
+              <w:left w:val="single" w:color="E0E0E0" w:sz="4"/>
+              <w:bottom w:val="single" w:color="E0E0E0" w:sz="4"/>
+              <w:right w:val="single" w:color="E0E0E0" w:sz="4"/>
+            </w:tcBorders>
+            <w:shd w:fill="FAFAFA" w:val="clear"/>
+            <w:tcMar>
+              <w:top w:type="dxa" w:w="60"/>
+              <w:left w:type="dxa" w:w="160"/>
+              <w:bottom w:type="dxa" w:w="60"/>
+              <w:right w:type="dxa" w:w="160"/>
+            </w:tcMar>
+          </w:tcPr>
+          <w:p>
+            <w:r>
+              <w:rPr>
+                <w:sz w:val="22"/>
+                <w:szCs w:val="22"/>
+              </w:rPr>
+              <w:t xml:space="preserve"/>
+            </w:r>
+          </w:p>
+        </w:tc>
+      </w:tr>
+    </w:tbl>
+    <w:p>
+      <w:r>
+        <w:br w:type="page"/>
+      </w:r>
     </w:p>
     <w:p>
       <w:pPr>
@@ -2956,7 +2444,7 @@
           <w:sz w:val="22"/>
           <w:szCs w:val="22"/>
         </w:rPr>
-        <w:t xml:space="preserve">Elige un hallazgo de impacto alto: ¿cómo lo corregirías y qué otro pilar empeora con esa corrección?</w:t>
+        <w:t xml:space="preserve">Tu hallazgo número uno: cómo lo corregirías y qué otro pilar empeora con esa corrección.</w:t>
       </w:r>
     </w:p>
     <w:tbl>
@@ -3070,48 +2558,11 @@
           </w:p>
         </w:tc>
       </w:tr>
-      <w:tr>
-        <w:trPr>
-          <w:trHeight w:val="480"/>
-        </w:trPr>
-        <w:tc>
-          <w:tcPr>
-            <w:tcW w:type="dxa" w:w="9638"/>
-            <w:tcBorders>
-              <w:top w:val="single" w:color="E0E0E0" w:sz="4"/>
-              <w:left w:val="single" w:color="E0E0E0" w:sz="4"/>
-              <w:bottom w:val="single" w:color="E0E0E0" w:sz="4"/>
-              <w:right w:val="single" w:color="E0E0E0" w:sz="4"/>
-            </w:tcBorders>
-            <w:shd w:fill="FAFAFA" w:val="clear"/>
-            <w:tcMar>
-              <w:top w:type="dxa" w:w="60"/>
-              <w:left w:type="dxa" w:w="160"/>
-              <w:bottom w:type="dxa" w:w="60"/>
-              <w:right w:type="dxa" w:w="160"/>
-            </w:tcMar>
-          </w:tcPr>
-          <w:p>
-            <w:r>
-              <w:rPr>
-                <w:sz w:val="22"/>
-                <w:szCs w:val="22"/>
-              </w:rPr>
-              <w:t xml:space="preserve"/>
-            </w:r>
-          </w:p>
-        </w:tc>
-      </w:tr>
     </w:tbl>
     <w:p>
       <w:pPr>
-        <w:spacing w:after="200"/>
+        <w:spacing w:after="120"/>
       </w:pPr>
-    </w:p>
-    <w:p>
-      <w:r>
-        <w:br w:type="page"/>
-      </w:r>
     </w:p>
     <w:p>
       <w:pPr>
@@ -3260,8 +2711,22 @@
     </w:tbl>
     <w:p>
       <w:pPr>
-        <w:spacing w:after="120"/>
+        <w:spacing w:after="80"/>
       </w:pPr>
+    </w:p>
+    <w:p>
+      <w:pPr>
+        <w:spacing w:after="100"/>
+      </w:pPr>
+      <w:r>
+        <w:rPr>
+          <w:rFonts w:ascii="Arial" w:cs="Arial" w:eastAsia="Arial" w:hAnsi="Arial"/>
+          <w:color w:val="212121"/>
+          <w:sz w:val="22"/>
+          <w:szCs w:val="22"/>
+        </w:rPr>
+        <w:t xml:space="preserve">Tus tres cálculos de disponibilidad total (la ficha tal cual, con 4 instancias y con base de datos Multi-AZ) y las horas de caída al año de cada uno:</w:t>
+      </w:r>
     </w:p>
     <w:tbl>
       <w:tblPr>
@@ -3279,41 +2744,40 @@
         <w:gridCol w:w="9638"/>
       </w:tblGrid>
       <w:tr>
+        <w:trPr>
+          <w:trHeight w:val="480"/>
+        </w:trPr>
         <w:tc>
           <w:tcPr>
             <w:tcW w:type="dxa" w:w="9638"/>
             <w:tcBorders>
-              <w:top w:val="none" w:color="FFFFFF" w:sz="0"/>
-              <w:left w:val="none" w:color="FFFFFF" w:sz="0"/>
-              <w:bottom w:val="none" w:color="FFFFFF" w:sz="0"/>
-              <w:right w:val="none" w:color="FFFFFF" w:sz="0"/>
-            </w:tcBorders>
-            <w:shd w:fill="3949AB" w:val="clear"/>
-            <w:tcMar>
-              <w:top w:type="dxa" w:w="80"/>
+              <w:top w:val="single" w:color="E0E0E0" w:sz="4"/>
+              <w:left w:val="single" w:color="E0E0E0" w:sz="4"/>
+              <w:bottom w:val="single" w:color="E0E0E0" w:sz="4"/>
+              <w:right w:val="single" w:color="E0E0E0" w:sz="4"/>
+            </w:tcBorders>
+            <w:shd w:fill="FAFAFA" w:val="clear"/>
+            <w:tcMar>
+              <w:top w:type="dxa" w:w="60"/>
               <w:left w:type="dxa" w:w="160"/>
-              <w:bottom w:type="dxa" w:w="80"/>
+              <w:bottom w:type="dxa" w:w="60"/>
               <w:right w:type="dxa" w:w="160"/>
             </w:tcMar>
           </w:tcPr>
           <w:p>
             <w:r>
               <w:rPr>
-                <w:rFonts w:ascii="Arial" w:cs="Arial" w:eastAsia="Arial" w:hAnsi="Arial"/>
-                <w:b/>
-                <w:bCs/>
-                <w:color w:val="FFFFFF"/>
-                <w:sz w:val="20"/>
-                <w:szCs w:val="20"/>
-              </w:rPr>
-              <w:t xml:space="preserve">📸 Tus cálculos de disponibilidad total (tu configuración real, con 4 instancias y con base de datos Multi-AZ) y las horas de caída al año de cada uno</w:t>
-            </w:r>
-          </w:p>
-        </w:tc>
-      </w:tr>
-      <w:tr>
-        <w:trPr>
-          <w:trHeight w:val="2400"/>
+                <w:sz w:val="22"/>
+                <w:szCs w:val="22"/>
+              </w:rPr>
+              <w:t xml:space="preserve"/>
+            </w:r>
+          </w:p>
+        </w:tc>
+      </w:tr>
+      <w:tr>
+        <w:trPr>
+          <w:trHeight w:val="480"/>
         </w:trPr>
         <w:tc>
           <w:tcPr>
@@ -3326,26 +2790,147 @@
             </w:tcBorders>
             <w:shd w:fill="FAFAFA" w:val="clear"/>
             <w:tcMar>
-              <w:top w:type="dxa" w:w="80"/>
+              <w:top w:type="dxa" w:w="60"/>
               <w:left w:type="dxa" w:w="160"/>
-              <w:bottom w:type="dxa" w:w="80"/>
+              <w:bottom w:type="dxa" w:w="60"/>
               <w:right w:type="dxa" w:w="160"/>
             </w:tcMar>
           </w:tcPr>
           <w:p>
-            <w:pPr>
-              <w:jc w:val="center"/>
-            </w:pPr>
-            <w:r>
-              <w:rPr>
-                <w:rFonts w:ascii="Arial" w:cs="Arial" w:eastAsia="Arial" w:hAnsi="Arial"/>
-                <w:i/>
-                <w:iCs/>
-                <w:color w:val="757575"/>
-                <w:sz w:val="20"/>
-                <w:szCs w:val="20"/>
-              </w:rPr>
-              <w:t xml:space="preserve">[Pega aquí la captura de pantalla]</w:t>
+            <w:r>
+              <w:rPr>
+                <w:sz w:val="22"/>
+                <w:szCs w:val="22"/>
+              </w:rPr>
+              <w:t xml:space="preserve"/>
+            </w:r>
+          </w:p>
+        </w:tc>
+      </w:tr>
+      <w:tr>
+        <w:trPr>
+          <w:trHeight w:val="480"/>
+        </w:trPr>
+        <w:tc>
+          <w:tcPr>
+            <w:tcW w:type="dxa" w:w="9638"/>
+            <w:tcBorders>
+              <w:top w:val="single" w:color="E0E0E0" w:sz="4"/>
+              <w:left w:val="single" w:color="E0E0E0" w:sz="4"/>
+              <w:bottom w:val="single" w:color="E0E0E0" w:sz="4"/>
+              <w:right w:val="single" w:color="E0E0E0" w:sz="4"/>
+            </w:tcBorders>
+            <w:shd w:fill="FAFAFA" w:val="clear"/>
+            <w:tcMar>
+              <w:top w:type="dxa" w:w="60"/>
+              <w:left w:type="dxa" w:w="160"/>
+              <w:bottom w:type="dxa" w:w="60"/>
+              <w:right w:type="dxa" w:w="160"/>
+            </w:tcMar>
+          </w:tcPr>
+          <w:p>
+            <w:r>
+              <w:rPr>
+                <w:sz w:val="22"/>
+                <w:szCs w:val="22"/>
+              </w:rPr>
+              <w:t xml:space="preserve"/>
+            </w:r>
+          </w:p>
+        </w:tc>
+      </w:tr>
+      <w:tr>
+        <w:trPr>
+          <w:trHeight w:val="480"/>
+        </w:trPr>
+        <w:tc>
+          <w:tcPr>
+            <w:tcW w:type="dxa" w:w="9638"/>
+            <w:tcBorders>
+              <w:top w:val="single" w:color="E0E0E0" w:sz="4"/>
+              <w:left w:val="single" w:color="E0E0E0" w:sz="4"/>
+              <w:bottom w:val="single" w:color="E0E0E0" w:sz="4"/>
+              <w:right w:val="single" w:color="E0E0E0" w:sz="4"/>
+            </w:tcBorders>
+            <w:shd w:fill="FAFAFA" w:val="clear"/>
+            <w:tcMar>
+              <w:top w:type="dxa" w:w="60"/>
+              <w:left w:type="dxa" w:w="160"/>
+              <w:bottom w:type="dxa" w:w="60"/>
+              <w:right w:type="dxa" w:w="160"/>
+            </w:tcMar>
+          </w:tcPr>
+          <w:p>
+            <w:r>
+              <w:rPr>
+                <w:sz w:val="22"/>
+                <w:szCs w:val="22"/>
+              </w:rPr>
+              <w:t xml:space="preserve"/>
+            </w:r>
+          </w:p>
+        </w:tc>
+      </w:tr>
+      <w:tr>
+        <w:trPr>
+          <w:trHeight w:val="480"/>
+        </w:trPr>
+        <w:tc>
+          <w:tcPr>
+            <w:tcW w:type="dxa" w:w="9638"/>
+            <w:tcBorders>
+              <w:top w:val="single" w:color="E0E0E0" w:sz="4"/>
+              <w:left w:val="single" w:color="E0E0E0" w:sz="4"/>
+              <w:bottom w:val="single" w:color="E0E0E0" w:sz="4"/>
+              <w:right w:val="single" w:color="E0E0E0" w:sz="4"/>
+            </w:tcBorders>
+            <w:shd w:fill="FAFAFA" w:val="clear"/>
+            <w:tcMar>
+              <w:top w:type="dxa" w:w="60"/>
+              <w:left w:type="dxa" w:w="160"/>
+              <w:bottom w:type="dxa" w:w="60"/>
+              <w:right w:type="dxa" w:w="160"/>
+            </w:tcMar>
+          </w:tcPr>
+          <w:p>
+            <w:r>
+              <w:rPr>
+                <w:sz w:val="22"/>
+                <w:szCs w:val="22"/>
+              </w:rPr>
+              <w:t xml:space="preserve"/>
+            </w:r>
+          </w:p>
+        </w:tc>
+      </w:tr>
+      <w:tr>
+        <w:trPr>
+          <w:trHeight w:val="480"/>
+        </w:trPr>
+        <w:tc>
+          <w:tcPr>
+            <w:tcW w:type="dxa" w:w="9638"/>
+            <w:tcBorders>
+              <w:top w:val="single" w:color="E0E0E0" w:sz="4"/>
+              <w:left w:val="single" w:color="E0E0E0" w:sz="4"/>
+              <w:bottom w:val="single" w:color="E0E0E0" w:sz="4"/>
+              <w:right w:val="single" w:color="E0E0E0" w:sz="4"/>
+            </w:tcBorders>
+            <w:shd w:fill="FAFAFA" w:val="clear"/>
+            <w:tcMar>
+              <w:top w:type="dxa" w:w="60"/>
+              <w:left w:type="dxa" w:w="160"/>
+              <w:bottom w:type="dxa" w:w="60"/>
+              <w:right w:type="dxa" w:w="160"/>
+            </w:tcMar>
+          </w:tcPr>
+          <w:p>
+            <w:r>
+              <w:rPr>
+                <w:sz w:val="22"/>
+                <w:szCs w:val="22"/>
+              </w:rPr>
+              <w:t xml:space="preserve"/>
             </w:r>
           </w:p>
         </w:tc>
@@ -3353,7 +2938,7 @@
     </w:tbl>
     <w:p>
       <w:pPr>
-        <w:spacing w:after="160"/>
+        <w:spacing w:after="80"/>
       </w:pPr>
     </w:p>
     <w:p>
@@ -3386,7 +2971,7 @@
           <w:sz w:val="22"/>
           <w:szCs w:val="22"/>
         </w:rPr>
-        <w:t xml:space="preserve">Si tu base de datos hubiera caído hoy a las 10:00: ¿cuál habría sido tu RTO real y tu RPO real? ¿Cuál de las dos cifras te habría preocupado más?</w:t>
+        <w:t xml:space="preserve">Si la base de datos de la ficha hubiera caído hoy a las 10:00: ¿cuál habría sido el RTO real y el RPO real? ¿Cuál de las dos cifras te preocuparía más?</w:t>
       </w:r>
     </w:p>
     <w:tbl>
@@ -3500,44 +3085,7 @@
           </w:p>
         </w:tc>
       </w:tr>
-      <w:tr>
-        <w:trPr>
-          <w:trHeight w:val="480"/>
-        </w:trPr>
-        <w:tc>
-          <w:tcPr>
-            <w:tcW w:type="dxa" w:w="9638"/>
-            <w:tcBorders>
-              <w:top w:val="single" w:color="E0E0E0" w:sz="4"/>
-              <w:left w:val="single" w:color="E0E0E0" w:sz="4"/>
-              <w:bottom w:val="single" w:color="E0E0E0" w:sz="4"/>
-              <w:right w:val="single" w:color="E0E0E0" w:sz="4"/>
-            </w:tcBorders>
-            <w:shd w:fill="FAFAFA" w:val="clear"/>
-            <w:tcMar>
-              <w:top w:type="dxa" w:w="60"/>
-              <w:left w:type="dxa" w:w="160"/>
-              <w:bottom w:type="dxa" w:w="60"/>
-              <w:right w:type="dxa" w:w="160"/>
-            </w:tcMar>
-          </w:tcPr>
-          <w:p>
-            <w:r>
-              <w:rPr>
-                <w:sz w:val="22"/>
-                <w:szCs w:val="22"/>
-              </w:rPr>
-              <w:t xml:space="preserve"/>
-            </w:r>
-          </w:p>
-        </w:tc>
-      </w:tr>
     </w:tbl>
-    <w:p>
-      <w:pPr>
-        <w:spacing w:after="200"/>
-      </w:pPr>
-    </w:p>
     <w:p>
       <w:r>
         <w:br w:type="page"/>
@@ -3563,7 +3111,7 @@
     </w:p>
     <w:p>
       <w:pPr>
-        <w:spacing w:after="120"/>
+        <w:spacing w:after="80"/>
       </w:pPr>
     </w:p>
     <w:p>
@@ -3582,7 +3130,7 @@
           <w:sz w:val="24"/>
           <w:szCs w:val="24"/>
         </w:rPr>
-        <w:t xml:space="preserve">Inventario y hallazgos priorizados</w:t>
+        <w:t xml:space="preserve">Tabla de hallazgos priorizada</w:t>
       </w:r>
     </w:p>
     <w:tbl>
@@ -4646,11 +4194,6 @@
         </w:tc>
       </w:tr>
     </w:tbl>
-    <w:p>
-      <w:pPr>
-        <w:spacing w:after="200"/>
-      </w:pPr>
-    </w:p>
     <w:p>
       <w:r>
         <w:br w:type="page"/>
@@ -4686,7 +4229,7 @@
           <w:sz w:val="22"/>
           <w:szCs w:val="22"/>
         </w:rPr>
-        <w:t xml:space="preserve">Compute Optimizer (cambiar a m5.large) y Trusted Advisor (apagar fuera de horario): para cada una, ¿se aplica tal cual, modificada o se descarta? Justifica con los datos del caso, incluida la memoria y la copia nocturna.</w:t>
+        <w:t xml:space="preserve">Compute Optimizer (cambiar a m5.large) y Trusted Advisor (apagar fuera de horario): para cada una, ¿se aplica tal cual, modificada o se descarta? Justifica con los datos de la ficha, incluida la memoria y la copia nocturna.</w:t>
       </w:r>
     </w:p>
     <w:tbl>
@@ -4896,42 +4439,10 @@
           </w:p>
         </w:tc>
       </w:tr>
-      <w:tr>
-        <w:trPr>
-          <w:trHeight w:val="480"/>
-        </w:trPr>
-        <w:tc>
-          <w:tcPr>
-            <w:tcW w:type="dxa" w:w="9638"/>
-            <w:tcBorders>
-              <w:top w:val="single" w:color="E0E0E0" w:sz="4"/>
-              <w:left w:val="single" w:color="E0E0E0" w:sz="4"/>
-              <w:bottom w:val="single" w:color="E0E0E0" w:sz="4"/>
-              <w:right w:val="single" w:color="E0E0E0" w:sz="4"/>
-            </w:tcBorders>
-            <w:shd w:fill="FAFAFA" w:val="clear"/>
-            <w:tcMar>
-              <w:top w:type="dxa" w:w="60"/>
-              <w:left w:type="dxa" w:w="160"/>
-              <w:bottom w:type="dxa" w:w="60"/>
-              <w:right w:type="dxa" w:w="160"/>
-            </w:tcMar>
-          </w:tcPr>
-          <w:p>
-            <w:r>
-              <w:rPr>
-                <w:sz w:val="22"/>
-                <w:szCs w:val="22"/>
-              </w:rPr>
-              <w:t xml:space="preserve"/>
-            </w:r>
-          </w:p>
-        </w:tc>
-      </w:tr>
     </w:tbl>
     <w:p>
       <w:pPr>
-        <w:spacing w:after="160"/>
+        <w:spacing w:after="120"/>
       </w:pPr>
     </w:p>
     <w:p>
@@ -4996,7 +4507,7 @@
                 <w:sz w:val="20"/>
                 <w:szCs w:val="20"/>
               </w:rPr>
-              <w:t xml:space="preserve">📸 Calculadora de precios de AWS con la estimación mensual de tu plan de mejora</w:t>
+              <w:t xml:space="preserve">📸 Calculadora de precios de AWS con la estimación mensual de tu plan de mejora (con tu identificador como nombre de la estimación)</w:t>
             </w:r>
           </w:p>
         </w:tc>
@@ -5043,7 +4554,7 @@
     </w:tbl>
     <w:p>
       <w:pPr>
-        <w:spacing w:after="120"/>
+        <w:spacing w:after="80"/>
       </w:pPr>
     </w:p>
     <w:p>
@@ -5203,44 +4714,7 @@
           </w:p>
         </w:tc>
       </w:tr>
-      <w:tr>
-        <w:trPr>
-          <w:trHeight w:val="480"/>
-        </w:trPr>
-        <w:tc>
-          <w:tcPr>
-            <w:tcW w:type="dxa" w:w="9638"/>
-            <w:tcBorders>
-              <w:top w:val="single" w:color="E0E0E0" w:sz="4"/>
-              <w:left w:val="single" w:color="E0E0E0" w:sz="4"/>
-              <w:bottom w:val="single" w:color="E0E0E0" w:sz="4"/>
-              <w:right w:val="single" w:color="E0E0E0" w:sz="4"/>
-            </w:tcBorders>
-            <w:shd w:fill="FAFAFA" w:val="clear"/>
-            <w:tcMar>
-              <w:top w:type="dxa" w:w="60"/>
-              <w:left w:type="dxa" w:w="160"/>
-              <w:bottom w:type="dxa" w:w="60"/>
-              <w:right w:type="dxa" w:w="160"/>
-            </w:tcMar>
-          </w:tcPr>
-          <w:p>
-            <w:r>
-              <w:rPr>
-                <w:sz w:val="22"/>
-                <w:szCs w:val="22"/>
-              </w:rPr>
-              <w:t xml:space="preserve"/>
-            </w:r>
-          </w:p>
-        </w:tc>
-      </w:tr>
     </w:tbl>
-    <w:p>
-      <w:pPr>
-        <w:spacing w:after="200"/>
-      </w:pPr>
-    </w:p>
     <w:p>
       <w:r>
         <w:br w:type="page"/>

</xml_diff>